<commit_message>
e-Daftar: sebab penempatan semula (senarai+autofill), e-Resit: kongsi WhatsApp dengan PDF, pautan Panduan
- e-Daftar: medan Sebab kini senarai rasmi 4 pilihan; Catatan diisi automatik (boleh diedit); rekod lama teks bebas dipaparkan sebagai (rekod lama).
- e-Resit: Buka WhatsApp memuat turun PDF resit serentak (kotak pilihan); butang Kongsi PDF (peranti) melalui Web Share API.
- Pautan Panduan Pengguna (PDF) pada bar navigasi atas, footer dan halaman log masuk; salinan PDF dihos pada /panduan/ dan dikemas kini setiap kali manual dijana semula.
- Dialog borang murid kini boleh skrol dengan bar tindakan melekat (sticky) untuk skrin rendah.
- Manual Pengguna & Teknikal (PDF/DOCX) dijana semula dengan 10 tangkapan skrin baharu.
</commit_message>
<xml_diff>
--- a/docs/Panduan_Teknikal_SPeRK.docx
+++ b/docs/Panduan_Teknikal_SPeRK.docx
@@ -448,7 +448,7 @@
     <w:p>
       <w:pPr>
         <w:pStyle w:val="NormalWeb"/>
-        <w:divId w:val="1891457442"/>
+        <w:divId w:val="43987151"/>
         <w:rPr>
           <w:rFonts w:ascii="Calibri" w:hAnsi="Calibri" w:cs="Calibri"/>
           <w:color w:val="1F2937"/>
@@ -1610,9 +1610,9 @@
         <w:tblLook w:val="04A0" w:firstRow="1" w:lastRow="0" w:firstColumn="1" w:lastColumn="0" w:noHBand="0" w:noVBand="1"/>
       </w:tblPr>
       <w:tblGrid>
-        <w:gridCol w:w="1689"/>
-        <w:gridCol w:w="4063"/>
-        <w:gridCol w:w="3254"/>
+        <w:gridCol w:w="1593"/>
+        <w:gridCol w:w="4422"/>
+        <w:gridCol w:w="2991"/>
       </w:tblGrid>
       <w:tr>
         <w:trPr>
@@ -2356,7 +2356,7 @@
                 <w:sz w:val="20"/>
                 <w:szCs w:val="20"/>
               </w:rPr>
-              <w:t>, fon Plus Jakarta Sans &amp; Inter (dihos sendiri)</w:t>
+              <w:t>, fon Plus Jakarta Sans &amp; Inter (dihos sendiri), dan salinan PDF Panduan Pengguna</w:t>
             </w:r>
           </w:p>
         </w:tc>
@@ -2620,6 +2620,82 @@
     </w:p>
     <w:p>
       <w:pPr>
+        <w:numPr>
+          <w:ilvl w:val="0"/>
+          <w:numId w:val="2"/>
+        </w:numPr>
+        <w:spacing w:before="100" w:beforeAutospacing="1" w:after="100" w:afterAutospacing="1"/>
+        <w:rPr>
+          <w:rFonts w:ascii="Calibri" w:eastAsia="Times New Roman" w:hAnsi="Calibri" w:cs="Calibri"/>
+          <w:color w:val="1F2937"/>
+          <w:sz w:val="22"/>
+          <w:szCs w:val="22"/>
+          <w:lang w:val="ms-MY"/>
+        </w:rPr>
+      </w:pPr>
+      <w:r>
+        <w:rPr>
+          <w:rStyle w:val="Strong"/>
+          <w:rFonts w:ascii="Calibri" w:eastAsia="Times New Roman" w:hAnsi="Calibri" w:cs="Calibri"/>
+          <w:color w:val="1F2937"/>
+          <w:sz w:val="22"/>
+          <w:szCs w:val="22"/>
+          <w:lang w:val="ms-MY"/>
+        </w:rPr>
+        <w:t>Panduan awam:</w:t>
+      </w:r>
+      <w:r>
+        <w:rPr>
+          <w:rFonts w:ascii="Calibri" w:eastAsia="Times New Roman" w:hAnsi="Calibri" w:cs="Calibri"/>
+          <w:color w:val="1F2937"/>
+          <w:sz w:val="22"/>
+          <w:szCs w:val="22"/>
+          <w:lang w:val="ms-MY"/>
+        </w:rPr>
+        <w:t xml:space="preserve"> salinan PDF </w:t>
+      </w:r>
+      <w:r>
+        <w:rPr>
+          <w:rStyle w:val="Emphasis"/>
+          <w:rFonts w:ascii="Calibri" w:eastAsia="Times New Roman" w:hAnsi="Calibri" w:cs="Calibri"/>
+          <w:color w:val="1F2937"/>
+          <w:sz w:val="22"/>
+          <w:szCs w:val="22"/>
+          <w:lang w:val="ms-MY"/>
+        </w:rPr>
+        <w:t>Panduan Pengguna</w:t>
+      </w:r>
+      <w:r>
+        <w:rPr>
+          <w:rFonts w:ascii="Calibri" w:eastAsia="Times New Roman" w:hAnsi="Calibri" w:cs="Calibri"/>
+          <w:color w:val="1F2937"/>
+          <w:sz w:val="22"/>
+          <w:szCs w:val="22"/>
+          <w:lang w:val="ms-MY"/>
+        </w:rPr>
+        <w:t xml:space="preserve"> dihos pada laman hadapan — </w:t>
+      </w:r>
+      <w:r>
+        <w:rPr>
+          <w:rStyle w:val="HTMLCode"/>
+          <w:color w:val="1F2937"/>
+          <w:lang w:val="ms-MY"/>
+        </w:rPr>
+        <w:t>https://sperk.smk-lohan.workers.dev/panduan/Panduan_Pengguna_SPeRK.pdf</w:t>
+      </w:r>
+      <w:r>
+        <w:rPr>
+          <w:rFonts w:ascii="Calibri" w:eastAsia="Times New Roman" w:hAnsi="Calibri" w:cs="Calibri"/>
+          <w:color w:val="1F2937"/>
+          <w:sz w:val="22"/>
+          <w:szCs w:val="22"/>
+          <w:lang w:val="ms-MY"/>
+        </w:rPr>
+        <w:t>.</w:t>
+      </w:r>
+    </w:p>
+    <w:p>
+      <w:pPr>
         <w:rPr>
           <w:rFonts w:ascii="Calibri" w:eastAsia="Times New Roman" w:hAnsi="Calibri" w:cs="Calibri"/>
           <w:color w:val="1F2937"/>
@@ -2706,7 +2782,15 @@
           <w:color w:val="1F2937"/>
           <w:lang w:val="ms-MY"/>
         </w:rPr>
-        <w:t xml:space="preserve">  1. Log masuk (e-mel + kata laluan)</w:t>
+        <w:t xml:space="preserve">  </w:t>
+      </w:r>
+      <w:r>
+        <w:rPr>
+          <w:rStyle w:val="HTMLCode"/>
+          <w:color w:val="1F2937"/>
+          <w:lang w:val="ms-MY"/>
+        </w:rPr>
+        <w:t>1. Log masuk (e-mel + kata laluan)</w:t>
       </w:r>
     </w:p>
     <w:p>
@@ -2854,15 +2938,7 @@
           <w:color w:val="1F2937"/>
           <w:lang w:val="ms-MY"/>
         </w:rPr>
-        <w:t xml:space="preserve">Cloudflare Worker "sperk" (fail statik)          </w:t>
-      </w:r>
-      <w:r>
-        <w:rPr>
-          <w:rStyle w:val="HTMLCode"/>
-          <w:color w:val="1F2937"/>
-          <w:lang w:val="ms-MY"/>
-        </w:rPr>
-        <w:t>Cloudflare Worker "sperk-smk-lohan-api"</w:t>
+        <w:t>Cloudflare Worker "sperk" (fail statik)          Cloudflare Worker "sperk-smk-lohan-api"</w:t>
       </w:r>
     </w:p>
     <w:p>
@@ -3063,7 +3139,15 @@
           <w:color w:val="1F2937"/>
           <w:lang w:val="ms-MY"/>
         </w:rPr>
-        <w:t xml:space="preserve">                                          Google Firestore (REST, akaun perkhidmatan)</w:t>
+        <w:t xml:space="preserve">                          </w:t>
+      </w:r>
+      <w:r>
+        <w:rPr>
+          <w:rStyle w:val="HTMLCode"/>
+          <w:color w:val="1F2937"/>
+          <w:lang w:val="ms-MY"/>
+        </w:rPr>
+        <w:t xml:space="preserve">                Google Firestore (REST, akaun perkhidmatan)</w:t>
       </w:r>
     </w:p>
     <w:p>
@@ -3180,17 +3264,7 @@
           <w:szCs w:val="22"/>
           <w:lang w:val="ms-MY"/>
         </w:rPr>
-        <w:t>Membaca</w:t>
-      </w:r>
-      <w:r>
-        <w:rPr>
-          <w:rFonts w:ascii="Calibri" w:eastAsia="Times New Roman" w:hAnsi="Calibri" w:cs="Calibri"/>
-          <w:color w:val="1F2937"/>
-          <w:sz w:val="22"/>
-          <w:szCs w:val="22"/>
-          <w:lang w:val="ms-MY"/>
-        </w:rPr>
-        <w:t xml:space="preserve"> </w:t>
+        <w:t xml:space="preserve">Membaca </w:t>
       </w:r>
       <w:r>
         <w:rPr>
@@ -3494,17 +3568,7 @@
           <w:szCs w:val="22"/>
           <w:lang w:val="ms-MY"/>
         </w:rPr>
-        <w:t xml:space="preserve"> </w:t>
-      </w:r>
-      <w:r>
-        <w:rPr>
-          <w:rFonts w:ascii="Calibri" w:hAnsi="Calibri" w:cs="Calibri"/>
-          <w:color w:val="1F2937"/>
-          <w:sz w:val="22"/>
-          <w:szCs w:val="22"/>
-          <w:lang w:val="ms-MY"/>
-        </w:rPr>
-        <w:t xml:space="preserve">worker hanya menerima permintaan daripada asalan dalam var </w:t>
+        <w:t xml:space="preserve"> worker hanya menerima permintaan daripada asalan dalam var </w:t>
       </w:r>
       <w:r>
         <w:rPr>
@@ -4894,7 +4958,7 @@
       <w:pPr>
         <w:pStyle w:val="NormalWeb"/>
         <w:ind w:right="720"/>
-        <w:divId w:val="497110989"/>
+        <w:divId w:val="25447729"/>
         <w:rPr>
           <w:rFonts w:ascii="Calibri" w:hAnsi="Calibri" w:cs="Calibri"/>
           <w:color w:val="1F2937"/>
@@ -4940,7 +5004,17 @@
           <w:szCs w:val="22"/>
           <w:lang w:val="ms-MY"/>
         </w:rPr>
-        <w:t xml:space="preserve"> telah dipin (</w:t>
+        <w:t xml:space="preserve"> </w:t>
+      </w:r>
+      <w:r>
+        <w:rPr>
+          <w:rFonts w:ascii="Calibri" w:hAnsi="Calibri" w:cs="Calibri"/>
+          <w:color w:val="1F2937"/>
+          <w:sz w:val="22"/>
+          <w:szCs w:val="22"/>
+          <w:lang w:val="ms-MY"/>
+        </w:rPr>
+        <w:t>telah dipin (</w:t>
       </w:r>
       <w:r>
         <w:rPr>
@@ -5479,7 +5553,16 @@
                 <w:sz w:val="20"/>
                 <w:szCs w:val="20"/>
               </w:rPr>
-              <w:t xml:space="preserve"> (kunci disimpan sebagai secret Cloudflare + fail setempat yang tidak di-commit)</w:t>
+              <w:t xml:space="preserve"> </w:t>
+            </w:r>
+            <w:r>
+              <w:rPr>
+                <w:rFonts w:ascii="Calibri" w:eastAsia="Times New Roman" w:hAnsi="Calibri" w:cs="Calibri"/>
+                <w:color w:val="1F2937"/>
+                <w:sz w:val="20"/>
+                <w:szCs w:val="20"/>
+              </w:rPr>
+              <w:t>(kunci disimpan sebagai secret Cloudflare + fail setempat yang tidak di-commit)</w:t>
             </w:r>
           </w:p>
         </w:tc>
@@ -6343,15 +6426,7 @@
           <w:color w:val="1F2937"/>
           <w:lang w:val="ms-MY"/>
         </w:rPr>
-        <w:t xml:space="preserve">                  </w:t>
-      </w:r>
-      <w:r>
-        <w:rPr>
-          <w:rStyle w:val="HTMLCode"/>
-          <w:color w:val="1F2937"/>
-          <w:lang w:val="ms-MY"/>
-        </w:rPr>
-        <w:t># Laman hadapan (Vite)</w:t>
+        <w:t xml:space="preserve">                  # Laman hadapan (Vite)</w:t>
       </w:r>
     </w:p>
     <w:p>
@@ -6435,7 +6510,7 @@
           <w:color w:val="1F2937"/>
           <w:lang w:val="ms-MY"/>
         </w:rPr>
-        <w:t xml:space="preserve">                 # logo.svg, fonts/</w:t>
+        <w:t xml:space="preserve">                 # logo.svg, fonts/, panduan/Panduan_Pengguna_SPeRK.pdf</w:t>
       </w:r>
     </w:p>
     <w:p>
@@ -6519,7 +6594,15 @@
           <w:color w:val="1F2937"/>
           <w:lang w:val="ms-MY"/>
         </w:rPr>
-        <w:t xml:space="preserve">           # name="sperk", assets ./dist, account_id</w:t>
+        <w:t xml:space="preserve">           </w:t>
+      </w:r>
+      <w:r>
+        <w:rPr>
+          <w:rStyle w:val="HTMLCode"/>
+          <w:color w:val="1F2937"/>
+          <w:lang w:val="ms-MY"/>
+        </w:rPr>
+        <w:t># name="sperk", assets ./dist, account_id</w:t>
       </w:r>
     </w:p>
     <w:p>
@@ -6629,15 +6712,7 @@
           <w:color w:val="1F2937"/>
           <w:lang w:val="ms-MY"/>
         </w:rPr>
-        <w:t xml:space="preserve">               </w:t>
-      </w:r>
-      <w:r>
-        <w:rPr>
-          <w:rStyle w:val="HTMLCode"/>
-          <w:color w:val="1F2937"/>
-          <w:lang w:val="ms-MY"/>
-        </w:rPr>
-        <w:t># (gitignored) FIREBASE_SERVICE_ACCOUNT, ALLOWED_EMAILS</w:t>
+        <w:t xml:space="preserve">               # (gitignored) FIREBASE_SERVICE_ACCOUNT, ALLOWED_EMAILS</w:t>
       </w:r>
     </w:p>
     <w:p>
@@ -7383,9 +7458,9 @@
         <w:tblLook w:val="04A0" w:firstRow="1" w:lastRow="0" w:firstColumn="1" w:lastColumn="0" w:noHBand="0" w:noVBand="1"/>
       </w:tblPr>
       <w:tblGrid>
-        <w:gridCol w:w="3046"/>
-        <w:gridCol w:w="1246"/>
-        <w:gridCol w:w="4714"/>
+        <w:gridCol w:w="2445"/>
+        <w:gridCol w:w="1130"/>
+        <w:gridCol w:w="5431"/>
       </w:tblGrid>
       <w:tr>
         <w:trPr>
@@ -8609,7 +8684,99 @@
                 <w:sz w:val="20"/>
                 <w:szCs w:val="20"/>
               </w:rPr>
-              <w:t>Permohonan penempatan semula (teks bebas sehingga senarai rasmi diterima).</w:t>
+              <w:t xml:space="preserve">Permohonan penempatan semula. </w:t>
+            </w:r>
+            <w:r>
+              <w:rPr>
+                <w:rStyle w:val="HTMLCode"/>
+                <w:color w:val="1F2937"/>
+              </w:rPr>
+              <w:t>transferReason</w:t>
+            </w:r>
+            <w:r>
+              <w:rPr>
+                <w:rFonts w:ascii="Calibri" w:eastAsia="Times New Roman" w:hAnsi="Calibri" w:cs="Calibri"/>
+                <w:color w:val="1F2937"/>
+                <w:sz w:val="20"/>
+                <w:szCs w:val="20"/>
+              </w:rPr>
+              <w:t xml:space="preserve"> dipilih daripada senarai rasmi (</w:t>
+            </w:r>
+            <w:r>
+              <w:rPr>
+                <w:rStyle w:val="HTMLCode"/>
+                <w:color w:val="1F2937"/>
+              </w:rPr>
+              <w:t>transferReasons</w:t>
+            </w:r>
+            <w:r>
+              <w:rPr>
+                <w:rFonts w:ascii="Calibri" w:eastAsia="Times New Roman" w:hAnsi="Calibri" w:cs="Calibri"/>
+                <w:color w:val="1F2937"/>
+                <w:sz w:val="20"/>
+                <w:szCs w:val="20"/>
+              </w:rPr>
+              <w:t xml:space="preserve"> dalam </w:t>
+            </w:r>
+            <w:r>
+              <w:rPr>
+                <w:rStyle w:val="HTMLCode"/>
+                <w:color w:val="1F2937"/>
+              </w:rPr>
+              <w:t>frontend/src/features/e-daftar/constants.js</w:t>
+            </w:r>
+            <w:r>
+              <w:rPr>
+                <w:rFonts w:ascii="Calibri" w:eastAsia="Times New Roman" w:hAnsi="Calibri" w:cs="Calibri"/>
+                <w:color w:val="1F2937"/>
+                <w:sz w:val="20"/>
+                <w:szCs w:val="20"/>
+              </w:rPr>
+              <w:t xml:space="preserve">); </w:t>
+            </w:r>
+            <w:r>
+              <w:rPr>
+                <w:rStyle w:val="HTMLCode"/>
+                <w:color w:val="1F2937"/>
+              </w:rPr>
+              <w:t>transferNotes</w:t>
+            </w:r>
+            <w:r>
+              <w:rPr>
+                <w:rFonts w:ascii="Calibri" w:eastAsia="Times New Roman" w:hAnsi="Calibri" w:cs="Calibri"/>
+                <w:color w:val="1F2937"/>
+                <w:sz w:val="20"/>
+                <w:szCs w:val="20"/>
+              </w:rPr>
+              <w:t xml:space="preserve"> </w:t>
+            </w:r>
+            <w:r>
+              <w:rPr>
+                <w:rFonts w:ascii="Calibri" w:eastAsia="Times New Roman" w:hAnsi="Calibri" w:cs="Calibri"/>
+                <w:color w:val="1F2937"/>
+                <w:sz w:val="20"/>
+                <w:szCs w:val="20"/>
+              </w:rPr>
+              <w:t xml:space="preserve">diisi automatik dengan huraian sebab tersebut (boleh diedit). Nilai teks lain (import/rekod lama) tetap diterima dan dipaparkan sebagai </w:t>
+            </w:r>
+            <w:r>
+              <w:rPr>
+                <w:rStyle w:val="Emphasis"/>
+                <w:rFonts w:ascii="Calibri" w:eastAsia="Times New Roman" w:hAnsi="Calibri" w:cs="Calibri"/>
+                <w:color w:val="1F2937"/>
+                <w:sz w:val="20"/>
+                <w:szCs w:val="20"/>
+              </w:rPr>
+              <w:t>"(rekod lama)"</w:t>
+            </w:r>
+            <w:r>
+              <w:rPr>
+                <w:rFonts w:ascii="Calibri" w:eastAsia="Times New Roman" w:hAnsi="Calibri" w:cs="Calibri"/>
+                <w:color w:val="1F2937"/>
+                <w:sz w:val="20"/>
+                <w:szCs w:val="20"/>
+              </w:rPr>
+              <w:t xml:space="preserve"> dalam borang.</w:t>
             </w:r>
           </w:p>
         </w:tc>
@@ -9309,7 +9476,16 @@
                 <w:sz w:val="20"/>
                 <w:szCs w:val="20"/>
               </w:rPr>
-              <w:t xml:space="preserve">, contoh </w:t>
+              <w:t>, contoh</w:t>
+            </w:r>
+            <w:r>
+              <w:rPr>
+                <w:rFonts w:ascii="Calibri" w:eastAsia="Times New Roman" w:hAnsi="Calibri" w:cs="Calibri"/>
+                <w:color w:val="1F2937"/>
+                <w:sz w:val="20"/>
+                <w:szCs w:val="20"/>
+              </w:rPr>
+              <w:t xml:space="preserve"> </w:t>
             </w:r>
             <w:r>
               <w:rPr>
@@ -10350,17 +10526,7 @@
           <w:szCs w:val="22"/>
           <w:lang w:val="ms-MY"/>
         </w:rPr>
-        <w:t xml:space="preserve"> </w:t>
-      </w:r>
-      <w:r>
-        <w:rPr>
-          <w:rFonts w:ascii="Calibri" w:hAnsi="Calibri" w:cs="Calibri"/>
-          <w:color w:val="1F2937"/>
-          <w:sz w:val="22"/>
-          <w:szCs w:val="22"/>
-          <w:lang w:val="ms-MY"/>
-        </w:rPr>
-        <w:t>di dalam transaksi Firestore (</w:t>
+        <w:t xml:space="preserve"> di dalam transaksi Firestore (</w:t>
       </w:r>
       <w:r>
         <w:rPr>
@@ -11107,16 +11273,7 @@
                 <w:sz w:val="20"/>
                 <w:szCs w:val="20"/>
               </w:rPr>
-              <w:t xml:space="preserve"> </w:t>
-            </w:r>
-            <w:r>
-              <w:rPr>
-                <w:rFonts w:ascii="Calibri" w:eastAsia="Times New Roman" w:hAnsi="Calibri" w:cs="Calibri"/>
-                <w:color w:val="1F2937"/>
-                <w:sz w:val="20"/>
-                <w:szCs w:val="20"/>
-              </w:rPr>
-              <w:t>untuk Keahlian Koperasi), kuantiti dikunci pada nilai itu dalam borang resit.</w:t>
+              <w:t xml:space="preserve"> untuk Keahlian Koperasi), kuantiti dikunci pada nilai itu dalam borang resit.</w:t>
             </w:r>
           </w:p>
         </w:tc>
@@ -11589,6 +11746,250 @@
           <w:lang w:val="ms-MY"/>
         </w:rPr>
         <w:t>.</w:t>
+      </w:r>
+    </w:p>
+    <w:p>
+      <w:pPr>
+        <w:numPr>
+          <w:ilvl w:val="0"/>
+          <w:numId w:val="4"/>
+        </w:numPr>
+        <w:spacing w:before="100" w:beforeAutospacing="1" w:after="100" w:afterAutospacing="1"/>
+        <w:rPr>
+          <w:rFonts w:ascii="Calibri" w:eastAsia="Times New Roman" w:hAnsi="Calibri" w:cs="Calibri"/>
+          <w:color w:val="1F2937"/>
+          <w:sz w:val="22"/>
+          <w:szCs w:val="22"/>
+          <w:lang w:val="ms-MY"/>
+        </w:rPr>
+      </w:pPr>
+      <w:r>
+        <w:rPr>
+          <w:rStyle w:val="Strong"/>
+          <w:rFonts w:ascii="Calibri" w:eastAsia="Times New Roman" w:hAnsi="Calibri" w:cs="Calibri"/>
+          <w:color w:val="1F2937"/>
+          <w:sz w:val="22"/>
+          <w:szCs w:val="22"/>
+          <w:lang w:val="ms-MY"/>
+        </w:rPr>
+        <w:t>Panduan dalam app:</w:t>
+      </w:r>
+      <w:r>
+        <w:rPr>
+          <w:rFonts w:ascii="Calibri" w:eastAsia="Times New Roman" w:hAnsi="Calibri" w:cs="Calibri"/>
+          <w:color w:val="1F2937"/>
+          <w:sz w:val="22"/>
+          <w:szCs w:val="22"/>
+          <w:lang w:val="ms-MY"/>
+        </w:rPr>
+        <w:t xml:space="preserve"> pautan </w:t>
+      </w:r>
+      <w:r>
+        <w:rPr>
+          <w:rStyle w:val="Strong"/>
+          <w:rFonts w:ascii="Calibri" w:eastAsia="Times New Roman" w:hAnsi="Calibri" w:cs="Calibri"/>
+          <w:color w:val="1F2937"/>
+          <w:sz w:val="22"/>
+          <w:szCs w:val="22"/>
+          <w:lang w:val="ms-MY"/>
+        </w:rPr>
+        <w:t>Panduan</w:t>
+      </w:r>
+      <w:r>
+        <w:rPr>
+          <w:rFonts w:ascii="Calibri" w:eastAsia="Times New Roman" w:hAnsi="Calibri" w:cs="Calibri"/>
+          <w:color w:val="1F2937"/>
+          <w:sz w:val="22"/>
+          <w:szCs w:val="22"/>
+          <w:lang w:val="ms-MY"/>
+        </w:rPr>
+        <w:t xml:space="preserve"> (bar atas), </w:t>
+      </w:r>
+      <w:r>
+        <w:rPr>
+          <w:rStyle w:val="Strong"/>
+          <w:rFonts w:ascii="Calibri" w:eastAsia="Times New Roman" w:hAnsi="Calibri" w:cs="Calibri"/>
+          <w:color w:val="1F2937"/>
+          <w:sz w:val="22"/>
+          <w:szCs w:val="22"/>
+          <w:lang w:val="ms-MY"/>
+        </w:rPr>
+        <w:t>Panduan Pengguna (PDF)</w:t>
+      </w:r>
+      <w:r>
+        <w:rPr>
+          <w:rFonts w:ascii="Calibri" w:eastAsia="Times New Roman" w:hAnsi="Calibri" w:cs="Calibri"/>
+          <w:color w:val="1F2937"/>
+          <w:sz w:val="22"/>
+          <w:szCs w:val="22"/>
+          <w:lang w:val="ms-MY"/>
+        </w:rPr>
+        <w:t xml:space="preserve"> (footer dan halaman log masuk) merujuk kepada </w:t>
+      </w:r>
+      <w:r>
+        <w:rPr>
+          <w:rStyle w:val="HTMLCode"/>
+          <w:color w:val="1F2937"/>
+          <w:lang w:val="ms-MY"/>
+        </w:rPr>
+        <w:t>public/panduan/Panduan_Pengguna_SPeRK.pdf</w:t>
+      </w:r>
+      <w:r>
+        <w:rPr>
+          <w:rFonts w:ascii="Calibri" w:eastAsia="Times New Roman" w:hAnsi="Calibri" w:cs="Calibri"/>
+          <w:color w:val="1F2937"/>
+          <w:sz w:val="22"/>
+          <w:szCs w:val="22"/>
+          <w:lang w:val="ms-MY"/>
+        </w:rPr>
+        <w:t xml:space="preserve">. Setiap kali manual dijana semula, salin PDF baharu ke folder itu sebelum </w:t>
+      </w:r>
+      <w:r>
+        <w:rPr>
+          <w:rStyle w:val="HTMLCode"/>
+          <w:color w:val="1F2937"/>
+          <w:lang w:val="ms-MY"/>
+        </w:rPr>
+        <w:t>npm run build</w:t>
+      </w:r>
+      <w:r>
+        <w:rPr>
+          <w:rFonts w:ascii="Calibri" w:eastAsia="Times New Roman" w:hAnsi="Calibri" w:cs="Calibri"/>
+          <w:color w:val="1F2937"/>
+          <w:sz w:val="22"/>
+          <w:szCs w:val="22"/>
+          <w:lang w:val="ms-MY"/>
+        </w:rPr>
+        <w:t>.</w:t>
+      </w:r>
+    </w:p>
+    <w:p>
+      <w:pPr>
+        <w:numPr>
+          <w:ilvl w:val="0"/>
+          <w:numId w:val="4"/>
+        </w:numPr>
+        <w:spacing w:before="100" w:beforeAutospacing="1" w:after="100" w:afterAutospacing="1"/>
+        <w:rPr>
+          <w:rFonts w:ascii="Calibri" w:eastAsia="Times New Roman" w:hAnsi="Calibri" w:cs="Calibri"/>
+          <w:color w:val="1F2937"/>
+          <w:sz w:val="22"/>
+          <w:szCs w:val="22"/>
+          <w:lang w:val="ms-MY"/>
+        </w:rPr>
+      </w:pPr>
+      <w:r>
+        <w:rPr>
+          <w:rStyle w:val="Strong"/>
+          <w:rFonts w:ascii="Calibri" w:eastAsia="Times New Roman" w:hAnsi="Calibri" w:cs="Calibri"/>
+          <w:color w:val="1F2937"/>
+          <w:sz w:val="22"/>
+          <w:szCs w:val="22"/>
+          <w:lang w:val="ms-MY"/>
+        </w:rPr>
+        <w:t>Kongsi WhatsApp:</w:t>
+      </w:r>
+      <w:r>
+        <w:rPr>
+          <w:rFonts w:ascii="Calibri" w:eastAsia="Times New Roman" w:hAnsi="Calibri" w:cs="Calibri"/>
+          <w:color w:val="1F2937"/>
+          <w:sz w:val="22"/>
+          <w:szCs w:val="22"/>
+          <w:lang w:val="ms-MY"/>
+        </w:rPr>
+        <w:t xml:space="preserve"> WhatsApp tidak membenarkan lampiran fail melalui pautan </w:t>
+      </w:r>
+      <w:r>
+        <w:rPr>
+          <w:rStyle w:val="HTMLCode"/>
+          <w:color w:val="1F2937"/>
+          <w:lang w:val="ms-MY"/>
+        </w:rPr>
+        <w:t>wa.me</w:t>
+      </w:r>
+      <w:r>
+        <w:rPr>
+          <w:rFonts w:ascii="Calibri" w:eastAsia="Times New Roman" w:hAnsi="Calibri" w:cs="Calibri"/>
+          <w:color w:val="1F2937"/>
+          <w:sz w:val="22"/>
+          <w:szCs w:val="22"/>
+          <w:lang w:val="ms-MY"/>
+        </w:rPr>
+        <w:t xml:space="preserve">. App memuat turun PDF serentak apabila </w:t>
+      </w:r>
+      <w:r>
+        <w:rPr>
+          <w:rStyle w:val="Strong"/>
+          <w:rFonts w:ascii="Calibri" w:eastAsia="Times New Roman" w:hAnsi="Calibri" w:cs="Calibri"/>
+          <w:color w:val="1F2937"/>
+          <w:sz w:val="22"/>
+          <w:szCs w:val="22"/>
+          <w:lang w:val="ms-MY"/>
+        </w:rPr>
+        <w:t>Buka WhatsApp</w:t>
+      </w:r>
+      <w:r>
+        <w:rPr>
+          <w:rFonts w:ascii="Calibri" w:eastAsia="Times New Roman" w:hAnsi="Calibri" w:cs="Calibri"/>
+          <w:color w:val="1F2937"/>
+          <w:sz w:val="22"/>
+          <w:szCs w:val="22"/>
+          <w:lang w:val="ms-MY"/>
+        </w:rPr>
+        <w:t xml:space="preserve"> ditekan (kotak </w:t>
+      </w:r>
+      <w:r>
+        <w:rPr>
+          <w:rStyle w:val="Emphasis"/>
+          <w:rFonts w:ascii="Calibri" w:eastAsia="Times New Roman" w:hAnsi="Calibri" w:cs="Calibri"/>
+          <w:color w:val="1F2937"/>
+          <w:sz w:val="22"/>
+          <w:szCs w:val="22"/>
+          <w:lang w:val="ms-MY"/>
+        </w:rPr>
+        <w:t>"Muat turun PDF resit supaya boleh dilampirkan</w:t>
+      </w:r>
+      <w:r>
+        <w:rPr>
+          <w:rStyle w:val="Emphasis"/>
+          <w:rFonts w:ascii="Calibri" w:eastAsia="Times New Roman" w:hAnsi="Calibri" w:cs="Calibri"/>
+          <w:color w:val="1F2937"/>
+          <w:sz w:val="22"/>
+          <w:szCs w:val="22"/>
+          <w:lang w:val="ms-MY"/>
+        </w:rPr>
+        <w:t>"</w:t>
+      </w:r>
+      <w:r>
+        <w:rPr>
+          <w:rFonts w:ascii="Calibri" w:eastAsia="Times New Roman" w:hAnsi="Calibri" w:cs="Calibri"/>
+          <w:color w:val="1F2937"/>
+          <w:sz w:val="22"/>
+          <w:szCs w:val="22"/>
+          <w:lang w:val="ms-MY"/>
+        </w:rPr>
+        <w:t xml:space="preserve">), dan menyediakan butang </w:t>
+      </w:r>
+      <w:r>
+        <w:rPr>
+          <w:rStyle w:val="Strong"/>
+          <w:rFonts w:ascii="Calibri" w:eastAsia="Times New Roman" w:hAnsi="Calibri" w:cs="Calibri"/>
+          <w:color w:val="1F2937"/>
+          <w:sz w:val="22"/>
+          <w:szCs w:val="22"/>
+          <w:lang w:val="ms-MY"/>
+        </w:rPr>
+        <w:t>Kongsi PDF (peranti)</w:t>
+      </w:r>
+      <w:r>
+        <w:rPr>
+          <w:rFonts w:ascii="Calibri" w:eastAsia="Times New Roman" w:hAnsi="Calibri" w:cs="Calibri"/>
+          <w:color w:val="1F2937"/>
+          <w:sz w:val="22"/>
+          <w:szCs w:val="22"/>
+          <w:lang w:val="ms-MY"/>
+        </w:rPr>
+        <w:t xml:space="preserve"> melalui Web Share API pada peranti yang menyokong perkongsian fail (Android/iPhone).</w:t>
       </w:r>
     </w:p>
     <w:p>
@@ -13769,7 +14170,15 @@
           <w:color w:val="1F2937"/>
           <w:lang w:val="ms-MY"/>
         </w:rPr>
-        <w:t># {"status":"ok","time":"..."}</w:t>
+        <w:t># {"status":"ok","time</w:t>
+      </w:r>
+      <w:r>
+        <w:rPr>
+          <w:rStyle w:val="HTMLCode"/>
+          <w:color w:val="1F2937"/>
+          <w:lang w:val="ms-MY"/>
+        </w:rPr>
+        <w:t>":"..."}</w:t>
       </w:r>
     </w:p>
     <w:p>
@@ -14046,17 +14455,7 @@
           <w:szCs w:val="22"/>
           <w:lang w:val="ms-MY"/>
         </w:rPr>
-        <w:t xml:space="preserve"> </w:t>
-      </w:r>
-      <w:r>
-        <w:rPr>
-          <w:rFonts w:ascii="Calibri" w:hAnsi="Calibri" w:cs="Calibri"/>
-          <w:color w:val="1F2937"/>
-          <w:sz w:val="22"/>
-          <w:szCs w:val="22"/>
-          <w:lang w:val="ms-MY"/>
-        </w:rPr>
-        <w:t xml:space="preserve">sudah dibenarkan dalam </w:t>
+        <w:t xml:space="preserve"> sudah dibenarkan dalam </w:t>
       </w:r>
       <w:r>
         <w:rPr>
@@ -14711,7 +15110,14 @@
           <w:rFonts w:eastAsia="Times New Roman"/>
           <w:lang w:val="ms-MY"/>
         </w:rPr>
-        <w:t>9. Pengurusan pengguna dan keselamatan</w:t>
+        <w:t>9. Pengurusan pengguna dan ke</w:t>
+      </w:r>
+      <w:r>
+        <w:rPr>
+          <w:rFonts w:eastAsia="Times New Roman"/>
+          <w:lang w:val="ms-MY"/>
+        </w:rPr>
+        <w:t>selamatan</w:t>
       </w:r>
     </w:p>
     <w:p>
@@ -19212,6 +19618,186 @@
                 <w:sz w:val="20"/>
                 <w:szCs w:val="20"/>
               </w:rPr>
+              <w:t xml:space="preserve">Penempatan semula: </w:t>
+            </w:r>
+            <w:r>
+              <w:rPr>
+                <w:rStyle w:val="Strong"/>
+                <w:rFonts w:ascii="Calibri" w:eastAsia="Times New Roman" w:hAnsi="Calibri" w:cs="Calibri"/>
+                <w:color w:val="1F2937"/>
+                <w:sz w:val="20"/>
+                <w:szCs w:val="20"/>
+              </w:rPr>
+              <w:t>Sebab</w:t>
+            </w:r>
+            <w:r>
+              <w:rPr>
+                <w:rFonts w:ascii="Calibri" w:eastAsia="Times New Roman" w:hAnsi="Calibri" w:cs="Calibri"/>
+                <w:color w:val="1F2937"/>
+                <w:sz w:val="20"/>
+                <w:szCs w:val="20"/>
+              </w:rPr>
+              <w:t xml:space="preserve"> kini senarai pilihan rasmi dengan </w:t>
+            </w:r>
+            <w:r>
+              <w:rPr>
+                <w:rStyle w:val="Strong"/>
+                <w:rFonts w:ascii="Calibri" w:eastAsia="Times New Roman" w:hAnsi="Calibri" w:cs="Calibri"/>
+                <w:color w:val="1F2937"/>
+                <w:sz w:val="20"/>
+                <w:szCs w:val="20"/>
+              </w:rPr>
+              <w:t>autofill Catatan</w:t>
+            </w:r>
+            <w:r>
+              <w:rPr>
+                <w:rFonts w:ascii="Calibri" w:eastAsia="Times New Roman" w:hAnsi="Calibri" w:cs="Calibri"/>
+                <w:color w:val="1F2937"/>
+                <w:sz w:val="20"/>
+                <w:szCs w:val="20"/>
+              </w:rPr>
+              <w:t xml:space="preserve">; </w:t>
+            </w:r>
+            <w:r>
+              <w:rPr>
+                <w:rStyle w:val="Strong"/>
+                <w:rFonts w:ascii="Calibri" w:eastAsia="Times New Roman" w:hAnsi="Calibri" w:cs="Calibri"/>
+                <w:color w:val="1F2937"/>
+                <w:sz w:val="20"/>
+                <w:szCs w:val="20"/>
+              </w:rPr>
+              <w:t>Kongsi WhatsApp</w:t>
+            </w:r>
+            <w:r>
+              <w:rPr>
+                <w:rFonts w:ascii="Calibri" w:eastAsia="Times New Roman" w:hAnsi="Calibri" w:cs="Calibri"/>
+                <w:color w:val="1F2937"/>
+                <w:sz w:val="20"/>
+                <w:szCs w:val="20"/>
+              </w:rPr>
+              <w:t xml:space="preserve"> memuat turun PDF resit serentak (butang </w:t>
+            </w:r>
+            <w:r>
+              <w:rPr>
+                <w:rStyle w:val="Strong"/>
+                <w:rFonts w:ascii="Calibri" w:eastAsia="Times New Roman" w:hAnsi="Calibri" w:cs="Calibri"/>
+                <w:color w:val="1F2937"/>
+                <w:sz w:val="20"/>
+                <w:szCs w:val="20"/>
+              </w:rPr>
+              <w:t>Kongsi PDF</w:t>
+            </w:r>
+            <w:r>
+              <w:rPr>
+                <w:rFonts w:ascii="Calibri" w:eastAsia="Times New Roman" w:hAnsi="Calibri" w:cs="Calibri"/>
+                <w:color w:val="1F2937"/>
+                <w:sz w:val="20"/>
+                <w:szCs w:val="20"/>
+              </w:rPr>
+              <w:t xml:space="preserve"> pada peranti menyokong Web Share); pautan </w:t>
+            </w:r>
+            <w:r>
+              <w:rPr>
+                <w:rStyle w:val="Strong"/>
+                <w:rFonts w:ascii="Calibri" w:eastAsia="Times New Roman" w:hAnsi="Calibri" w:cs="Calibri"/>
+                <w:color w:val="1F2937"/>
+                <w:sz w:val="20"/>
+                <w:szCs w:val="20"/>
+              </w:rPr>
+              <w:t>Panduan Pengguna (PDF)</w:t>
+            </w:r>
+            <w:r>
+              <w:rPr>
+                <w:rFonts w:ascii="Calibri" w:eastAsia="Times New Roman" w:hAnsi="Calibri" w:cs="Calibri"/>
+                <w:color w:val="1F2937"/>
+                <w:sz w:val="20"/>
+                <w:szCs w:val="20"/>
+              </w:rPr>
+              <w:t xml:space="preserve"> </w:t>
+            </w:r>
+            <w:r>
+              <w:rPr>
+                <w:rFonts w:ascii="Calibri" w:eastAsia="Times New Roman" w:hAnsi="Calibri" w:cs="Calibri"/>
+                <w:color w:val="1F2937"/>
+                <w:sz w:val="20"/>
+                <w:szCs w:val="20"/>
+              </w:rPr>
+              <w:t>ditambah pada bar atas, footer dan halaman log masuk.</w:t>
+            </w:r>
+          </w:p>
+        </w:tc>
+      </w:tr>
+      <w:tr>
+        <w:tc>
+          <w:tcPr>
+            <w:tcW w:w="0" w:type="auto"/>
+            <w:tcBorders>
+              <w:top w:val="single" w:sz="8" w:space="0" w:color="94A3B8"/>
+              <w:left w:val="single" w:sz="8" w:space="0" w:color="94A3B8"/>
+              <w:bottom w:val="single" w:sz="8" w:space="0" w:color="94A3B8"/>
+              <w:right w:val="single" w:sz="8" w:space="0" w:color="94A3B8"/>
+            </w:tcBorders>
+            <w:tcMar>
+              <w:top w:w="60" w:type="dxa"/>
+              <w:left w:w="100" w:type="dxa"/>
+              <w:bottom w:w="60" w:type="dxa"/>
+              <w:right w:w="100" w:type="dxa"/>
+            </w:tcMar>
+            <w:hideMark/>
+          </w:tcPr>
+          <w:p>
+            <w:pPr>
+              <w:rPr>
+                <w:rFonts w:ascii="Calibri" w:eastAsia="Times New Roman" w:hAnsi="Calibri" w:cs="Calibri"/>
+                <w:color w:val="1F2937"/>
+                <w:sz w:val="20"/>
+                <w:szCs w:val="20"/>
+              </w:rPr>
+            </w:pPr>
+            <w:r>
+              <w:rPr>
+                <w:rFonts w:ascii="Calibri" w:eastAsia="Times New Roman" w:hAnsi="Calibri" w:cs="Calibri"/>
+                <w:color w:val="1F2937"/>
+                <w:sz w:val="20"/>
+                <w:szCs w:val="20"/>
+              </w:rPr>
+              <w:t>18 Okt 2026</w:t>
+            </w:r>
+          </w:p>
+        </w:tc>
+        <w:tc>
+          <w:tcPr>
+            <w:tcW w:w="0" w:type="auto"/>
+            <w:tcBorders>
+              <w:top w:val="single" w:sz="8" w:space="0" w:color="94A3B8"/>
+              <w:left w:val="single" w:sz="8" w:space="0" w:color="94A3B8"/>
+              <w:bottom w:val="single" w:sz="8" w:space="0" w:color="94A3B8"/>
+              <w:right w:val="single" w:sz="8" w:space="0" w:color="94A3B8"/>
+            </w:tcBorders>
+            <w:tcMar>
+              <w:top w:w="60" w:type="dxa"/>
+              <w:left w:w="100" w:type="dxa"/>
+              <w:bottom w:w="60" w:type="dxa"/>
+              <w:right w:w="100" w:type="dxa"/>
+            </w:tcMar>
+            <w:hideMark/>
+          </w:tcPr>
+          <w:p>
+            <w:pPr>
+              <w:rPr>
+                <w:rFonts w:ascii="Calibri" w:eastAsia="Times New Roman" w:hAnsi="Calibri" w:cs="Calibri"/>
+                <w:color w:val="1F2937"/>
+                <w:sz w:val="20"/>
+                <w:szCs w:val="20"/>
+              </w:rPr>
+            </w:pPr>
+            <w:r>
+              <w:rPr>
+                <w:rFonts w:ascii="Calibri" w:eastAsia="Times New Roman" w:hAnsi="Calibri" w:cs="Calibri"/>
+                <w:color w:val="1F2937"/>
+                <w:sz w:val="20"/>
+                <w:szCs w:val="20"/>
+              </w:rPr>
               <w:t>Panduan Pengguna &amp; Panduan Teknikal (dokumen ini) diterbitkan bersama tangkapan skrin.</w:t>
             </w:r>
           </w:p>
@@ -19284,17 +19870,7 @@
           <w:szCs w:val="22"/>
           <w:lang w:val="ms-MY"/>
         </w:rPr>
-        <w:t xml:space="preserve"> </w:t>
-      </w:r>
-      <w:r>
-        <w:rPr>
-          <w:rFonts w:ascii="Calibri" w:hAnsi="Calibri" w:cs="Calibri"/>
-          <w:color w:val="1F2937"/>
-          <w:sz w:val="22"/>
-          <w:szCs w:val="22"/>
-          <w:lang w:val="ms-MY"/>
-        </w:rPr>
-        <w:t>(tiada akaun) masih wujud; boleh dipadamkan oleh pemiliknya pada bila-bila masa.</w:t>
+        <w:t xml:space="preserve"> (tiada akaun) masih wujud; boleh dipadamkan oleh pemiliknya pada bila-bila masa.</w:t>
       </w:r>
     </w:p>
     <w:p>
@@ -19819,235 +20395,9 @@
 <file path=word/numbering.xml><?xml version="1.0" encoding="utf-8"?>
 <w:numbering xmlns:wpc="http://schemas.microsoft.com/office/word/2010/wordprocessingCanvas" xmlns:cx="http://schemas.microsoft.com/office/drawing/2014/chartex" xmlns:cx1="http://schemas.microsoft.com/office/drawing/2015/9/8/chartex" xmlns:cx2="http://schemas.microsoft.com/office/drawing/2015/10/21/chartex" xmlns:cx3="http://schemas.microsoft.com/office/drawing/2016/5/9/chartex" xmlns:cx4="http://schemas.microsoft.com/office/drawing/2016/5/10/chartex" xmlns:cx5="http://schemas.microsoft.com/office/drawing/2016/5/11/chartex" xmlns:cx6="http://schemas.microsoft.com/office/drawing/2016/5/12/chartex" xmlns:cx7="http://schemas.microsoft.com/office/drawing/2016/5/13/chartex" xmlns:cx8="http://schemas.microsoft.com/office/drawing/2016/5/14/chartex" xmlns:mc="http://schemas.openxmlformats.org/markup-compatibility/2006" xmlns:aink="http://schemas.microsoft.com/office/drawing/2016/ink" xmlns:am3d="http://schemas.microsoft.com/office/drawing/2017/model3d" xmlns:o="urn:schemas-microsoft-com:office:office" xmlns:oel="http://schemas.microsoft.com/office/2019/extlst" xmlns:r="http://schemas.openxmlformats.org/officeDocument/2006/relationships" xmlns:m="http://schemas.openxmlformats.org/officeDocument/2006/math" xmlns:v="urn:schemas-microsoft-com:vml" xmlns:wp14="http://schemas.microsoft.com/office/word/2010/wordprocessingDrawing" xmlns:wp="http://schemas.openxmlformats.org/drawingml/2006/wordprocessingDrawing" xmlns:w10="urn:schemas-microsoft-com:office:word" xmlns:w="http://schemas.openxmlformats.org/wordprocessingml/2006/main" xmlns:w14="http://schemas.microsoft.com/office/word/2010/wordml" xmlns:w15="http://schemas.microsoft.com/office/word/2012/wordml" xmlns:w16cex="http://schemas.microsoft.com/office/word/2018/wordml/cex" xmlns:w16cid="http://schemas.microsoft.com/office/word/2016/wordml/cid" xmlns:w16="http://schemas.microsoft.com/office/word/2018/wordml" xmlns:w16du="http://schemas.microsoft.com/office/word/2023/wordml/word16du" xmlns:w16sdtdh="http://schemas.microsoft.com/office/word/2020/wordml/sdtdatahash" xmlns:w16sdtfl="http://schemas.microsoft.com/office/word/2024/wordml/sdtformatlock" xmlns:w16se="http://schemas.microsoft.com/office/word/2015/wordml/symex" xmlns:wpg="http://schemas.microsoft.com/office/word/2010/wordprocessingGroup" xmlns:wpi="http://schemas.microsoft.com/office/word/2010/wordprocessingInk" xmlns:wne="http://schemas.microsoft.com/office/word/2006/wordml" xmlns:wps="http://schemas.microsoft.com/office/word/2010/wordprocessingShape" mc:Ignorable="w14 w15 w16se w16cid w16 w16cex w16sdtdh w16sdtfl w16du wp14">
   <w:abstractNum w:abstractNumId="0" w15:restartNumberingAfterBreak="0">
-    <w:nsid w:val="274C38DA"/>
+    <w:nsid w:val="00EE5640"/>
     <w:multiLevelType w:val="multilevel"/>
-    <w:tmpl w:val="AA3A128A"/>
-    <w:lvl w:ilvl="0">
-      <w:start w:val="1"/>
-      <w:numFmt w:val="decimal"/>
-      <w:lvlText w:val="%1."/>
-      <w:lvlJc w:val="left"/>
-      <w:pPr>
-        <w:tabs>
-          <w:tab w:val="num" w:pos="720"/>
-        </w:tabs>
-        <w:ind w:left="720" w:hanging="360"/>
-      </w:pPr>
-    </w:lvl>
-    <w:lvl w:ilvl="1" w:tentative="1">
-      <w:start w:val="1"/>
-      <w:numFmt w:val="decimal"/>
-      <w:lvlText w:val="%2."/>
-      <w:lvlJc w:val="left"/>
-      <w:pPr>
-        <w:tabs>
-          <w:tab w:val="num" w:pos="1440"/>
-        </w:tabs>
-        <w:ind w:left="1440" w:hanging="360"/>
-      </w:pPr>
-    </w:lvl>
-    <w:lvl w:ilvl="2" w:tentative="1">
-      <w:start w:val="1"/>
-      <w:numFmt w:val="decimal"/>
-      <w:lvlText w:val="%3."/>
-      <w:lvlJc w:val="left"/>
-      <w:pPr>
-        <w:tabs>
-          <w:tab w:val="num" w:pos="2160"/>
-        </w:tabs>
-        <w:ind w:left="2160" w:hanging="360"/>
-      </w:pPr>
-    </w:lvl>
-    <w:lvl w:ilvl="3" w:tentative="1">
-      <w:start w:val="1"/>
-      <w:numFmt w:val="decimal"/>
-      <w:lvlText w:val="%4."/>
-      <w:lvlJc w:val="left"/>
-      <w:pPr>
-        <w:tabs>
-          <w:tab w:val="num" w:pos="2880"/>
-        </w:tabs>
-        <w:ind w:left="2880" w:hanging="360"/>
-      </w:pPr>
-    </w:lvl>
-    <w:lvl w:ilvl="4" w:tentative="1">
-      <w:start w:val="1"/>
-      <w:numFmt w:val="decimal"/>
-      <w:lvlText w:val="%5."/>
-      <w:lvlJc w:val="left"/>
-      <w:pPr>
-        <w:tabs>
-          <w:tab w:val="num" w:pos="3600"/>
-        </w:tabs>
-        <w:ind w:left="3600" w:hanging="360"/>
-      </w:pPr>
-    </w:lvl>
-    <w:lvl w:ilvl="5" w:tentative="1">
-      <w:start w:val="1"/>
-      <w:numFmt w:val="decimal"/>
-      <w:lvlText w:val="%6."/>
-      <w:lvlJc w:val="left"/>
-      <w:pPr>
-        <w:tabs>
-          <w:tab w:val="num" w:pos="4320"/>
-        </w:tabs>
-        <w:ind w:left="4320" w:hanging="360"/>
-      </w:pPr>
-    </w:lvl>
-    <w:lvl w:ilvl="6" w:tentative="1">
-      <w:start w:val="1"/>
-      <w:numFmt w:val="decimal"/>
-      <w:lvlText w:val="%7."/>
-      <w:lvlJc w:val="left"/>
-      <w:pPr>
-        <w:tabs>
-          <w:tab w:val="num" w:pos="5040"/>
-        </w:tabs>
-        <w:ind w:left="5040" w:hanging="360"/>
-      </w:pPr>
-    </w:lvl>
-    <w:lvl w:ilvl="7" w:tentative="1">
-      <w:start w:val="1"/>
-      <w:numFmt w:val="decimal"/>
-      <w:lvlText w:val="%8."/>
-      <w:lvlJc w:val="left"/>
-      <w:pPr>
-        <w:tabs>
-          <w:tab w:val="num" w:pos="5760"/>
-        </w:tabs>
-        <w:ind w:left="5760" w:hanging="360"/>
-      </w:pPr>
-    </w:lvl>
-    <w:lvl w:ilvl="8" w:tentative="1">
-      <w:start w:val="1"/>
-      <w:numFmt w:val="decimal"/>
-      <w:lvlText w:val="%9."/>
-      <w:lvlJc w:val="left"/>
-      <w:pPr>
-        <w:tabs>
-          <w:tab w:val="num" w:pos="6480"/>
-        </w:tabs>
-        <w:ind w:left="6480" w:hanging="360"/>
-      </w:pPr>
-    </w:lvl>
-  </w:abstractNum>
-  <w:abstractNum w:abstractNumId="1" w15:restartNumberingAfterBreak="0">
-    <w:nsid w:val="2CB0073A"/>
-    <w:multiLevelType w:val="multilevel"/>
-    <w:tmpl w:val="C3B45678"/>
-    <w:lvl w:ilvl="0">
-      <w:start w:val="3"/>
-      <w:numFmt w:val="decimal"/>
-      <w:lvlText w:val="%1."/>
-      <w:lvlJc w:val="left"/>
-      <w:pPr>
-        <w:tabs>
-          <w:tab w:val="num" w:pos="720"/>
-        </w:tabs>
-        <w:ind w:left="720" w:hanging="360"/>
-      </w:pPr>
-    </w:lvl>
-    <w:lvl w:ilvl="1" w:tentative="1">
-      <w:start w:val="1"/>
-      <w:numFmt w:val="decimal"/>
-      <w:lvlText w:val="%2."/>
-      <w:lvlJc w:val="left"/>
-      <w:pPr>
-        <w:tabs>
-          <w:tab w:val="num" w:pos="1440"/>
-        </w:tabs>
-        <w:ind w:left="1440" w:hanging="360"/>
-      </w:pPr>
-    </w:lvl>
-    <w:lvl w:ilvl="2" w:tentative="1">
-      <w:start w:val="1"/>
-      <w:numFmt w:val="decimal"/>
-      <w:lvlText w:val="%3."/>
-      <w:lvlJc w:val="left"/>
-      <w:pPr>
-        <w:tabs>
-          <w:tab w:val="num" w:pos="2160"/>
-        </w:tabs>
-        <w:ind w:left="2160" w:hanging="360"/>
-      </w:pPr>
-    </w:lvl>
-    <w:lvl w:ilvl="3" w:tentative="1">
-      <w:start w:val="1"/>
-      <w:numFmt w:val="decimal"/>
-      <w:lvlText w:val="%4."/>
-      <w:lvlJc w:val="left"/>
-      <w:pPr>
-        <w:tabs>
-          <w:tab w:val="num" w:pos="2880"/>
-        </w:tabs>
-        <w:ind w:left="2880" w:hanging="360"/>
-      </w:pPr>
-    </w:lvl>
-    <w:lvl w:ilvl="4" w:tentative="1">
-      <w:start w:val="1"/>
-      <w:numFmt w:val="decimal"/>
-      <w:lvlText w:val="%5."/>
-      <w:lvlJc w:val="left"/>
-      <w:pPr>
-        <w:tabs>
-          <w:tab w:val="num" w:pos="3600"/>
-        </w:tabs>
-        <w:ind w:left="3600" w:hanging="360"/>
-      </w:pPr>
-    </w:lvl>
-    <w:lvl w:ilvl="5" w:tentative="1">
-      <w:start w:val="1"/>
-      <w:numFmt w:val="decimal"/>
-      <w:lvlText w:val="%6."/>
-      <w:lvlJc w:val="left"/>
-      <w:pPr>
-        <w:tabs>
-          <w:tab w:val="num" w:pos="4320"/>
-        </w:tabs>
-        <w:ind w:left="4320" w:hanging="360"/>
-      </w:pPr>
-    </w:lvl>
-    <w:lvl w:ilvl="6" w:tentative="1">
-      <w:start w:val="1"/>
-      <w:numFmt w:val="decimal"/>
-      <w:lvlText w:val="%7."/>
-      <w:lvlJc w:val="left"/>
-      <w:pPr>
-        <w:tabs>
-          <w:tab w:val="num" w:pos="5040"/>
-        </w:tabs>
-        <w:ind w:left="5040" w:hanging="360"/>
-      </w:pPr>
-    </w:lvl>
-    <w:lvl w:ilvl="7" w:tentative="1">
-      <w:start w:val="1"/>
-      <w:numFmt w:val="decimal"/>
-      <w:lvlText w:val="%8."/>
-      <w:lvlJc w:val="left"/>
-      <w:pPr>
-        <w:tabs>
-          <w:tab w:val="num" w:pos="5760"/>
-        </w:tabs>
-        <w:ind w:left="5760" w:hanging="360"/>
-      </w:pPr>
-    </w:lvl>
-    <w:lvl w:ilvl="8" w:tentative="1">
-      <w:start w:val="1"/>
-      <w:numFmt w:val="decimal"/>
-      <w:lvlText w:val="%9."/>
-      <w:lvlJc w:val="left"/>
-      <w:pPr>
-        <w:tabs>
-          <w:tab w:val="num" w:pos="6480"/>
-        </w:tabs>
-        <w:ind w:left="6480" w:hanging="360"/>
-      </w:pPr>
-    </w:lvl>
-  </w:abstractNum>
-  <w:abstractNum w:abstractNumId="2" w15:restartNumberingAfterBreak="0">
-    <w:nsid w:val="327C09A9"/>
-    <w:multiLevelType w:val="multilevel"/>
-    <w:tmpl w:val="6EA6605A"/>
+    <w:tmpl w:val="1B421B34"/>
     <w:lvl w:ilvl="0">
       <w:start w:val="1"/>
       <w:numFmt w:val="bullet"/>
@@ -20193,10 +20543,353 @@
       </w:rPr>
     </w:lvl>
   </w:abstractNum>
+  <w:abstractNum w:abstractNumId="1" w15:restartNumberingAfterBreak="0">
+    <w:nsid w:val="0569361F"/>
+    <w:multiLevelType w:val="multilevel"/>
+    <w:tmpl w:val="19B0FF1E"/>
+    <w:lvl w:ilvl="0">
+      <w:start w:val="1"/>
+      <w:numFmt w:val="decimal"/>
+      <w:lvlText w:val="%1."/>
+      <w:lvlJc w:val="left"/>
+      <w:pPr>
+        <w:tabs>
+          <w:tab w:val="num" w:pos="720"/>
+        </w:tabs>
+        <w:ind w:left="720" w:hanging="360"/>
+      </w:pPr>
+    </w:lvl>
+    <w:lvl w:ilvl="1" w:tentative="1">
+      <w:start w:val="1"/>
+      <w:numFmt w:val="decimal"/>
+      <w:lvlText w:val="%2."/>
+      <w:lvlJc w:val="left"/>
+      <w:pPr>
+        <w:tabs>
+          <w:tab w:val="num" w:pos="1440"/>
+        </w:tabs>
+        <w:ind w:left="1440" w:hanging="360"/>
+      </w:pPr>
+    </w:lvl>
+    <w:lvl w:ilvl="2" w:tentative="1">
+      <w:start w:val="1"/>
+      <w:numFmt w:val="decimal"/>
+      <w:lvlText w:val="%3."/>
+      <w:lvlJc w:val="left"/>
+      <w:pPr>
+        <w:tabs>
+          <w:tab w:val="num" w:pos="2160"/>
+        </w:tabs>
+        <w:ind w:left="2160" w:hanging="360"/>
+      </w:pPr>
+    </w:lvl>
+    <w:lvl w:ilvl="3" w:tentative="1">
+      <w:start w:val="1"/>
+      <w:numFmt w:val="decimal"/>
+      <w:lvlText w:val="%4."/>
+      <w:lvlJc w:val="left"/>
+      <w:pPr>
+        <w:tabs>
+          <w:tab w:val="num" w:pos="2880"/>
+        </w:tabs>
+        <w:ind w:left="2880" w:hanging="360"/>
+      </w:pPr>
+    </w:lvl>
+    <w:lvl w:ilvl="4" w:tentative="1">
+      <w:start w:val="1"/>
+      <w:numFmt w:val="decimal"/>
+      <w:lvlText w:val="%5."/>
+      <w:lvlJc w:val="left"/>
+      <w:pPr>
+        <w:tabs>
+          <w:tab w:val="num" w:pos="3600"/>
+        </w:tabs>
+        <w:ind w:left="3600" w:hanging="360"/>
+      </w:pPr>
+    </w:lvl>
+    <w:lvl w:ilvl="5" w:tentative="1">
+      <w:start w:val="1"/>
+      <w:numFmt w:val="decimal"/>
+      <w:lvlText w:val="%6."/>
+      <w:lvlJc w:val="left"/>
+      <w:pPr>
+        <w:tabs>
+          <w:tab w:val="num" w:pos="4320"/>
+        </w:tabs>
+        <w:ind w:left="4320" w:hanging="360"/>
+      </w:pPr>
+    </w:lvl>
+    <w:lvl w:ilvl="6" w:tentative="1">
+      <w:start w:val="1"/>
+      <w:numFmt w:val="decimal"/>
+      <w:lvlText w:val="%7."/>
+      <w:lvlJc w:val="left"/>
+      <w:pPr>
+        <w:tabs>
+          <w:tab w:val="num" w:pos="5040"/>
+        </w:tabs>
+        <w:ind w:left="5040" w:hanging="360"/>
+      </w:pPr>
+    </w:lvl>
+    <w:lvl w:ilvl="7" w:tentative="1">
+      <w:start w:val="1"/>
+      <w:numFmt w:val="decimal"/>
+      <w:lvlText w:val="%8."/>
+      <w:lvlJc w:val="left"/>
+      <w:pPr>
+        <w:tabs>
+          <w:tab w:val="num" w:pos="5760"/>
+        </w:tabs>
+        <w:ind w:left="5760" w:hanging="360"/>
+      </w:pPr>
+    </w:lvl>
+    <w:lvl w:ilvl="8" w:tentative="1">
+      <w:start w:val="1"/>
+      <w:numFmt w:val="decimal"/>
+      <w:lvlText w:val="%9."/>
+      <w:lvlJc w:val="left"/>
+      <w:pPr>
+        <w:tabs>
+          <w:tab w:val="num" w:pos="6480"/>
+        </w:tabs>
+        <w:ind w:left="6480" w:hanging="360"/>
+      </w:pPr>
+    </w:lvl>
+  </w:abstractNum>
+  <w:abstractNum w:abstractNumId="2" w15:restartNumberingAfterBreak="0">
+    <w:nsid w:val="0D0A7128"/>
+    <w:multiLevelType w:val="multilevel"/>
+    <w:tmpl w:val="B754CB2C"/>
+    <w:lvl w:ilvl="0">
+      <w:start w:val="1"/>
+      <w:numFmt w:val="decimal"/>
+      <w:lvlText w:val="%1."/>
+      <w:lvlJc w:val="left"/>
+      <w:pPr>
+        <w:tabs>
+          <w:tab w:val="num" w:pos="720"/>
+        </w:tabs>
+        <w:ind w:left="720" w:hanging="360"/>
+      </w:pPr>
+    </w:lvl>
+    <w:lvl w:ilvl="1" w:tentative="1">
+      <w:start w:val="1"/>
+      <w:numFmt w:val="decimal"/>
+      <w:lvlText w:val="%2."/>
+      <w:lvlJc w:val="left"/>
+      <w:pPr>
+        <w:tabs>
+          <w:tab w:val="num" w:pos="1440"/>
+        </w:tabs>
+        <w:ind w:left="1440" w:hanging="360"/>
+      </w:pPr>
+    </w:lvl>
+    <w:lvl w:ilvl="2" w:tentative="1">
+      <w:start w:val="1"/>
+      <w:numFmt w:val="decimal"/>
+      <w:lvlText w:val="%3."/>
+      <w:lvlJc w:val="left"/>
+      <w:pPr>
+        <w:tabs>
+          <w:tab w:val="num" w:pos="2160"/>
+        </w:tabs>
+        <w:ind w:left="2160" w:hanging="360"/>
+      </w:pPr>
+    </w:lvl>
+    <w:lvl w:ilvl="3" w:tentative="1">
+      <w:start w:val="1"/>
+      <w:numFmt w:val="decimal"/>
+      <w:lvlText w:val="%4."/>
+      <w:lvlJc w:val="left"/>
+      <w:pPr>
+        <w:tabs>
+          <w:tab w:val="num" w:pos="2880"/>
+        </w:tabs>
+        <w:ind w:left="2880" w:hanging="360"/>
+      </w:pPr>
+    </w:lvl>
+    <w:lvl w:ilvl="4" w:tentative="1">
+      <w:start w:val="1"/>
+      <w:numFmt w:val="decimal"/>
+      <w:lvlText w:val="%5."/>
+      <w:lvlJc w:val="left"/>
+      <w:pPr>
+        <w:tabs>
+          <w:tab w:val="num" w:pos="3600"/>
+        </w:tabs>
+        <w:ind w:left="3600" w:hanging="360"/>
+      </w:pPr>
+    </w:lvl>
+    <w:lvl w:ilvl="5" w:tentative="1">
+      <w:start w:val="1"/>
+      <w:numFmt w:val="decimal"/>
+      <w:lvlText w:val="%6."/>
+      <w:lvlJc w:val="left"/>
+      <w:pPr>
+        <w:tabs>
+          <w:tab w:val="num" w:pos="4320"/>
+        </w:tabs>
+        <w:ind w:left="4320" w:hanging="360"/>
+      </w:pPr>
+    </w:lvl>
+    <w:lvl w:ilvl="6" w:tentative="1">
+      <w:start w:val="1"/>
+      <w:numFmt w:val="decimal"/>
+      <w:lvlText w:val="%7."/>
+      <w:lvlJc w:val="left"/>
+      <w:pPr>
+        <w:tabs>
+          <w:tab w:val="num" w:pos="5040"/>
+        </w:tabs>
+        <w:ind w:left="5040" w:hanging="360"/>
+      </w:pPr>
+    </w:lvl>
+    <w:lvl w:ilvl="7" w:tentative="1">
+      <w:start w:val="1"/>
+      <w:numFmt w:val="decimal"/>
+      <w:lvlText w:val="%8."/>
+      <w:lvlJc w:val="left"/>
+      <w:pPr>
+        <w:tabs>
+          <w:tab w:val="num" w:pos="5760"/>
+        </w:tabs>
+        <w:ind w:left="5760" w:hanging="360"/>
+      </w:pPr>
+    </w:lvl>
+    <w:lvl w:ilvl="8" w:tentative="1">
+      <w:start w:val="1"/>
+      <w:numFmt w:val="decimal"/>
+      <w:lvlText w:val="%9."/>
+      <w:lvlJc w:val="left"/>
+      <w:pPr>
+        <w:tabs>
+          <w:tab w:val="num" w:pos="6480"/>
+        </w:tabs>
+        <w:ind w:left="6480" w:hanging="360"/>
+      </w:pPr>
+    </w:lvl>
+  </w:abstractNum>
   <w:abstractNum w:abstractNumId="3" w15:restartNumberingAfterBreak="0">
-    <w:nsid w:val="336B3D96"/>
+    <w:nsid w:val="0D6E5AFF"/>
     <w:multiLevelType w:val="multilevel"/>
-    <w:tmpl w:val="E9587DE6"/>
+    <w:tmpl w:val="6E80AAB2"/>
+    <w:lvl w:ilvl="0">
+      <w:start w:val="1"/>
+      <w:numFmt w:val="decimal"/>
+      <w:lvlText w:val="%1."/>
+      <w:lvlJc w:val="left"/>
+      <w:pPr>
+        <w:tabs>
+          <w:tab w:val="num" w:pos="720"/>
+        </w:tabs>
+        <w:ind w:left="720" w:hanging="360"/>
+      </w:pPr>
+    </w:lvl>
+    <w:lvl w:ilvl="1">
+      <w:start w:val="1"/>
+      <w:numFmt w:val="bullet"/>
+      <w:lvlText w:val="o"/>
+      <w:lvlJc w:val="left"/>
+      <w:pPr>
+        <w:tabs>
+          <w:tab w:val="num" w:pos="1440"/>
+        </w:tabs>
+        <w:ind w:left="1440" w:hanging="360"/>
+      </w:pPr>
+      <w:rPr>
+        <w:rFonts w:ascii="Courier New" w:hAnsi="Courier New" w:hint="default"/>
+        <w:sz w:val="20"/>
+      </w:rPr>
+    </w:lvl>
+    <w:lvl w:ilvl="2" w:tentative="1">
+      <w:start w:val="1"/>
+      <w:numFmt w:val="decimal"/>
+      <w:lvlText w:val="%3."/>
+      <w:lvlJc w:val="left"/>
+      <w:pPr>
+        <w:tabs>
+          <w:tab w:val="num" w:pos="2160"/>
+        </w:tabs>
+        <w:ind w:left="2160" w:hanging="360"/>
+      </w:pPr>
+    </w:lvl>
+    <w:lvl w:ilvl="3" w:tentative="1">
+      <w:start w:val="1"/>
+      <w:numFmt w:val="decimal"/>
+      <w:lvlText w:val="%4."/>
+      <w:lvlJc w:val="left"/>
+      <w:pPr>
+        <w:tabs>
+          <w:tab w:val="num" w:pos="2880"/>
+        </w:tabs>
+        <w:ind w:left="2880" w:hanging="360"/>
+      </w:pPr>
+    </w:lvl>
+    <w:lvl w:ilvl="4" w:tentative="1">
+      <w:start w:val="1"/>
+      <w:numFmt w:val="decimal"/>
+      <w:lvlText w:val="%5."/>
+      <w:lvlJc w:val="left"/>
+      <w:pPr>
+        <w:tabs>
+          <w:tab w:val="num" w:pos="3600"/>
+        </w:tabs>
+        <w:ind w:left="3600" w:hanging="360"/>
+      </w:pPr>
+    </w:lvl>
+    <w:lvl w:ilvl="5" w:tentative="1">
+      <w:start w:val="1"/>
+      <w:numFmt w:val="decimal"/>
+      <w:lvlText w:val="%6."/>
+      <w:lvlJc w:val="left"/>
+      <w:pPr>
+        <w:tabs>
+          <w:tab w:val="num" w:pos="4320"/>
+        </w:tabs>
+        <w:ind w:left="4320" w:hanging="360"/>
+      </w:pPr>
+    </w:lvl>
+    <w:lvl w:ilvl="6" w:tentative="1">
+      <w:start w:val="1"/>
+      <w:numFmt w:val="decimal"/>
+      <w:lvlText w:val="%7."/>
+      <w:lvlJc w:val="left"/>
+      <w:pPr>
+        <w:tabs>
+          <w:tab w:val="num" w:pos="5040"/>
+        </w:tabs>
+        <w:ind w:left="5040" w:hanging="360"/>
+      </w:pPr>
+    </w:lvl>
+    <w:lvl w:ilvl="7" w:tentative="1">
+      <w:start w:val="1"/>
+      <w:numFmt w:val="decimal"/>
+      <w:lvlText w:val="%8."/>
+      <w:lvlJc w:val="left"/>
+      <w:pPr>
+        <w:tabs>
+          <w:tab w:val="num" w:pos="5760"/>
+        </w:tabs>
+        <w:ind w:left="5760" w:hanging="360"/>
+      </w:pPr>
+    </w:lvl>
+    <w:lvl w:ilvl="8" w:tentative="1">
+      <w:start w:val="1"/>
+      <w:numFmt w:val="decimal"/>
+      <w:lvlText w:val="%9."/>
+      <w:lvlJc w:val="left"/>
+      <w:pPr>
+        <w:tabs>
+          <w:tab w:val="num" w:pos="6480"/>
+        </w:tabs>
+        <w:ind w:left="6480" w:hanging="360"/>
+      </w:pPr>
+    </w:lvl>
+  </w:abstractNum>
+  <w:abstractNum w:abstractNumId="4" w15:restartNumberingAfterBreak="0">
+    <w:nsid w:val="1233508F"/>
+    <w:multiLevelType w:val="multilevel"/>
+    <w:tmpl w:val="63426962"/>
     <w:lvl w:ilvl="0">
       <w:start w:val="1"/>
       <w:numFmt w:val="bullet"/>
@@ -20342,10 +21035,10 @@
       </w:rPr>
     </w:lvl>
   </w:abstractNum>
-  <w:abstractNum w:abstractNumId="4" w15:restartNumberingAfterBreak="0">
-    <w:nsid w:val="3B0865ED"/>
+  <w:abstractNum w:abstractNumId="5" w15:restartNumberingAfterBreak="0">
+    <w:nsid w:val="17402252"/>
     <w:multiLevelType w:val="multilevel"/>
-    <w:tmpl w:val="E1CCFA3C"/>
+    <w:tmpl w:val="9C388744"/>
     <w:lvl w:ilvl="0">
       <w:start w:val="1"/>
       <w:numFmt w:val="decimal"/>
@@ -20455,353 +21148,10 @@
       </w:pPr>
     </w:lvl>
   </w:abstractNum>
-  <w:abstractNum w:abstractNumId="5" w15:restartNumberingAfterBreak="0">
-    <w:nsid w:val="3FFA0A6E"/>
+  <w:abstractNum w:abstractNumId="6" w15:restartNumberingAfterBreak="0">
+    <w:nsid w:val="17E86127"/>
     <w:multiLevelType w:val="multilevel"/>
-    <w:tmpl w:val="7DF82554"/>
-    <w:lvl w:ilvl="0">
-      <w:start w:val="1"/>
-      <w:numFmt w:val="decimal"/>
-      <w:lvlText w:val="%1."/>
-      <w:lvlJc w:val="left"/>
-      <w:pPr>
-        <w:tabs>
-          <w:tab w:val="num" w:pos="720"/>
-        </w:tabs>
-        <w:ind w:left="720" w:hanging="360"/>
-      </w:pPr>
-    </w:lvl>
-    <w:lvl w:ilvl="1" w:tentative="1">
-      <w:start w:val="1"/>
-      <w:numFmt w:val="decimal"/>
-      <w:lvlText w:val="%2."/>
-      <w:lvlJc w:val="left"/>
-      <w:pPr>
-        <w:tabs>
-          <w:tab w:val="num" w:pos="1440"/>
-        </w:tabs>
-        <w:ind w:left="1440" w:hanging="360"/>
-      </w:pPr>
-    </w:lvl>
-    <w:lvl w:ilvl="2" w:tentative="1">
-      <w:start w:val="1"/>
-      <w:numFmt w:val="decimal"/>
-      <w:lvlText w:val="%3."/>
-      <w:lvlJc w:val="left"/>
-      <w:pPr>
-        <w:tabs>
-          <w:tab w:val="num" w:pos="2160"/>
-        </w:tabs>
-        <w:ind w:left="2160" w:hanging="360"/>
-      </w:pPr>
-    </w:lvl>
-    <w:lvl w:ilvl="3" w:tentative="1">
-      <w:start w:val="1"/>
-      <w:numFmt w:val="decimal"/>
-      <w:lvlText w:val="%4."/>
-      <w:lvlJc w:val="left"/>
-      <w:pPr>
-        <w:tabs>
-          <w:tab w:val="num" w:pos="2880"/>
-        </w:tabs>
-        <w:ind w:left="2880" w:hanging="360"/>
-      </w:pPr>
-    </w:lvl>
-    <w:lvl w:ilvl="4" w:tentative="1">
-      <w:start w:val="1"/>
-      <w:numFmt w:val="decimal"/>
-      <w:lvlText w:val="%5."/>
-      <w:lvlJc w:val="left"/>
-      <w:pPr>
-        <w:tabs>
-          <w:tab w:val="num" w:pos="3600"/>
-        </w:tabs>
-        <w:ind w:left="3600" w:hanging="360"/>
-      </w:pPr>
-    </w:lvl>
-    <w:lvl w:ilvl="5" w:tentative="1">
-      <w:start w:val="1"/>
-      <w:numFmt w:val="decimal"/>
-      <w:lvlText w:val="%6."/>
-      <w:lvlJc w:val="left"/>
-      <w:pPr>
-        <w:tabs>
-          <w:tab w:val="num" w:pos="4320"/>
-        </w:tabs>
-        <w:ind w:left="4320" w:hanging="360"/>
-      </w:pPr>
-    </w:lvl>
-    <w:lvl w:ilvl="6" w:tentative="1">
-      <w:start w:val="1"/>
-      <w:numFmt w:val="decimal"/>
-      <w:lvlText w:val="%7."/>
-      <w:lvlJc w:val="left"/>
-      <w:pPr>
-        <w:tabs>
-          <w:tab w:val="num" w:pos="5040"/>
-        </w:tabs>
-        <w:ind w:left="5040" w:hanging="360"/>
-      </w:pPr>
-    </w:lvl>
-    <w:lvl w:ilvl="7" w:tentative="1">
-      <w:start w:val="1"/>
-      <w:numFmt w:val="decimal"/>
-      <w:lvlText w:val="%8."/>
-      <w:lvlJc w:val="left"/>
-      <w:pPr>
-        <w:tabs>
-          <w:tab w:val="num" w:pos="5760"/>
-        </w:tabs>
-        <w:ind w:left="5760" w:hanging="360"/>
-      </w:pPr>
-    </w:lvl>
-    <w:lvl w:ilvl="8" w:tentative="1">
-      <w:start w:val="1"/>
-      <w:numFmt w:val="decimal"/>
-      <w:lvlText w:val="%9."/>
-      <w:lvlJc w:val="left"/>
-      <w:pPr>
-        <w:tabs>
-          <w:tab w:val="num" w:pos="6480"/>
-        </w:tabs>
-        <w:ind w:left="6480" w:hanging="360"/>
-      </w:pPr>
-    </w:lvl>
-  </w:abstractNum>
-  <w:abstractNum w:abstractNumId="6" w15:restartNumberingAfterBreak="0">
-    <w:nsid w:val="44E00398"/>
-    <w:multiLevelType w:val="multilevel"/>
-    <w:tmpl w:val="34C03532"/>
-    <w:lvl w:ilvl="0">
-      <w:start w:val="1"/>
-      <w:numFmt w:val="decimal"/>
-      <w:lvlText w:val="%1."/>
-      <w:lvlJc w:val="left"/>
-      <w:pPr>
-        <w:tabs>
-          <w:tab w:val="num" w:pos="720"/>
-        </w:tabs>
-        <w:ind w:left="720" w:hanging="360"/>
-      </w:pPr>
-    </w:lvl>
-    <w:lvl w:ilvl="1" w:tentative="1">
-      <w:start w:val="1"/>
-      <w:numFmt w:val="decimal"/>
-      <w:lvlText w:val="%2."/>
-      <w:lvlJc w:val="left"/>
-      <w:pPr>
-        <w:tabs>
-          <w:tab w:val="num" w:pos="1440"/>
-        </w:tabs>
-        <w:ind w:left="1440" w:hanging="360"/>
-      </w:pPr>
-    </w:lvl>
-    <w:lvl w:ilvl="2" w:tentative="1">
-      <w:start w:val="1"/>
-      <w:numFmt w:val="decimal"/>
-      <w:lvlText w:val="%3."/>
-      <w:lvlJc w:val="left"/>
-      <w:pPr>
-        <w:tabs>
-          <w:tab w:val="num" w:pos="2160"/>
-        </w:tabs>
-        <w:ind w:left="2160" w:hanging="360"/>
-      </w:pPr>
-    </w:lvl>
-    <w:lvl w:ilvl="3" w:tentative="1">
-      <w:start w:val="1"/>
-      <w:numFmt w:val="decimal"/>
-      <w:lvlText w:val="%4."/>
-      <w:lvlJc w:val="left"/>
-      <w:pPr>
-        <w:tabs>
-          <w:tab w:val="num" w:pos="2880"/>
-        </w:tabs>
-        <w:ind w:left="2880" w:hanging="360"/>
-      </w:pPr>
-    </w:lvl>
-    <w:lvl w:ilvl="4" w:tentative="1">
-      <w:start w:val="1"/>
-      <w:numFmt w:val="decimal"/>
-      <w:lvlText w:val="%5."/>
-      <w:lvlJc w:val="left"/>
-      <w:pPr>
-        <w:tabs>
-          <w:tab w:val="num" w:pos="3600"/>
-        </w:tabs>
-        <w:ind w:left="3600" w:hanging="360"/>
-      </w:pPr>
-    </w:lvl>
-    <w:lvl w:ilvl="5" w:tentative="1">
-      <w:start w:val="1"/>
-      <w:numFmt w:val="decimal"/>
-      <w:lvlText w:val="%6."/>
-      <w:lvlJc w:val="left"/>
-      <w:pPr>
-        <w:tabs>
-          <w:tab w:val="num" w:pos="4320"/>
-        </w:tabs>
-        <w:ind w:left="4320" w:hanging="360"/>
-      </w:pPr>
-    </w:lvl>
-    <w:lvl w:ilvl="6" w:tentative="1">
-      <w:start w:val="1"/>
-      <w:numFmt w:val="decimal"/>
-      <w:lvlText w:val="%7."/>
-      <w:lvlJc w:val="left"/>
-      <w:pPr>
-        <w:tabs>
-          <w:tab w:val="num" w:pos="5040"/>
-        </w:tabs>
-        <w:ind w:left="5040" w:hanging="360"/>
-      </w:pPr>
-    </w:lvl>
-    <w:lvl w:ilvl="7" w:tentative="1">
-      <w:start w:val="1"/>
-      <w:numFmt w:val="decimal"/>
-      <w:lvlText w:val="%8."/>
-      <w:lvlJc w:val="left"/>
-      <w:pPr>
-        <w:tabs>
-          <w:tab w:val="num" w:pos="5760"/>
-        </w:tabs>
-        <w:ind w:left="5760" w:hanging="360"/>
-      </w:pPr>
-    </w:lvl>
-    <w:lvl w:ilvl="8" w:tentative="1">
-      <w:start w:val="1"/>
-      <w:numFmt w:val="decimal"/>
-      <w:lvlText w:val="%9."/>
-      <w:lvlJc w:val="left"/>
-      <w:pPr>
-        <w:tabs>
-          <w:tab w:val="num" w:pos="6480"/>
-        </w:tabs>
-        <w:ind w:left="6480" w:hanging="360"/>
-      </w:pPr>
-    </w:lvl>
-  </w:abstractNum>
-  <w:abstractNum w:abstractNumId="7" w15:restartNumberingAfterBreak="0">
-    <w:nsid w:val="713B44A6"/>
-    <w:multiLevelType w:val="multilevel"/>
-    <w:tmpl w:val="92D228FE"/>
-    <w:lvl w:ilvl="0">
-      <w:start w:val="1"/>
-      <w:numFmt w:val="decimal"/>
-      <w:lvlText w:val="%1."/>
-      <w:lvlJc w:val="left"/>
-      <w:pPr>
-        <w:tabs>
-          <w:tab w:val="num" w:pos="720"/>
-        </w:tabs>
-        <w:ind w:left="720" w:hanging="360"/>
-      </w:pPr>
-    </w:lvl>
-    <w:lvl w:ilvl="1">
-      <w:start w:val="1"/>
-      <w:numFmt w:val="bullet"/>
-      <w:lvlText w:val="o"/>
-      <w:lvlJc w:val="left"/>
-      <w:pPr>
-        <w:tabs>
-          <w:tab w:val="num" w:pos="1440"/>
-        </w:tabs>
-        <w:ind w:left="1440" w:hanging="360"/>
-      </w:pPr>
-      <w:rPr>
-        <w:rFonts w:ascii="Courier New" w:hAnsi="Courier New" w:hint="default"/>
-        <w:sz w:val="20"/>
-      </w:rPr>
-    </w:lvl>
-    <w:lvl w:ilvl="2" w:tentative="1">
-      <w:start w:val="1"/>
-      <w:numFmt w:val="decimal"/>
-      <w:lvlText w:val="%3."/>
-      <w:lvlJc w:val="left"/>
-      <w:pPr>
-        <w:tabs>
-          <w:tab w:val="num" w:pos="2160"/>
-        </w:tabs>
-        <w:ind w:left="2160" w:hanging="360"/>
-      </w:pPr>
-    </w:lvl>
-    <w:lvl w:ilvl="3" w:tentative="1">
-      <w:start w:val="1"/>
-      <w:numFmt w:val="decimal"/>
-      <w:lvlText w:val="%4."/>
-      <w:lvlJc w:val="left"/>
-      <w:pPr>
-        <w:tabs>
-          <w:tab w:val="num" w:pos="2880"/>
-        </w:tabs>
-        <w:ind w:left="2880" w:hanging="360"/>
-      </w:pPr>
-    </w:lvl>
-    <w:lvl w:ilvl="4" w:tentative="1">
-      <w:start w:val="1"/>
-      <w:numFmt w:val="decimal"/>
-      <w:lvlText w:val="%5."/>
-      <w:lvlJc w:val="left"/>
-      <w:pPr>
-        <w:tabs>
-          <w:tab w:val="num" w:pos="3600"/>
-        </w:tabs>
-        <w:ind w:left="3600" w:hanging="360"/>
-      </w:pPr>
-    </w:lvl>
-    <w:lvl w:ilvl="5" w:tentative="1">
-      <w:start w:val="1"/>
-      <w:numFmt w:val="decimal"/>
-      <w:lvlText w:val="%6."/>
-      <w:lvlJc w:val="left"/>
-      <w:pPr>
-        <w:tabs>
-          <w:tab w:val="num" w:pos="4320"/>
-        </w:tabs>
-        <w:ind w:left="4320" w:hanging="360"/>
-      </w:pPr>
-    </w:lvl>
-    <w:lvl w:ilvl="6" w:tentative="1">
-      <w:start w:val="1"/>
-      <w:numFmt w:val="decimal"/>
-      <w:lvlText w:val="%7."/>
-      <w:lvlJc w:val="left"/>
-      <w:pPr>
-        <w:tabs>
-          <w:tab w:val="num" w:pos="5040"/>
-        </w:tabs>
-        <w:ind w:left="5040" w:hanging="360"/>
-      </w:pPr>
-    </w:lvl>
-    <w:lvl w:ilvl="7" w:tentative="1">
-      <w:start w:val="1"/>
-      <w:numFmt w:val="decimal"/>
-      <w:lvlText w:val="%8."/>
-      <w:lvlJc w:val="left"/>
-      <w:pPr>
-        <w:tabs>
-          <w:tab w:val="num" w:pos="5760"/>
-        </w:tabs>
-        <w:ind w:left="5760" w:hanging="360"/>
-      </w:pPr>
-    </w:lvl>
-    <w:lvl w:ilvl="8" w:tentative="1">
-      <w:start w:val="1"/>
-      <w:numFmt w:val="decimal"/>
-      <w:lvlText w:val="%9."/>
-      <w:lvlJc w:val="left"/>
-      <w:pPr>
-        <w:tabs>
-          <w:tab w:val="num" w:pos="6480"/>
-        </w:tabs>
-        <w:ind w:left="6480" w:hanging="360"/>
-      </w:pPr>
-    </w:lvl>
-  </w:abstractNum>
-  <w:abstractNum w:abstractNumId="8" w15:restartNumberingAfterBreak="0">
-    <w:nsid w:val="76921DAA"/>
-    <w:multiLevelType w:val="multilevel"/>
-    <w:tmpl w:val="9668AFBE"/>
+    <w:tmpl w:val="DA8E3020"/>
     <w:lvl w:ilvl="0">
       <w:start w:val="1"/>
       <w:numFmt w:val="bullet"/>
@@ -20947,123 +21297,10 @@
       </w:rPr>
     </w:lvl>
   </w:abstractNum>
-  <w:abstractNum w:abstractNumId="9" w15:restartNumberingAfterBreak="0">
-    <w:nsid w:val="77A13625"/>
+  <w:abstractNum w:abstractNumId="7" w15:restartNumberingAfterBreak="0">
+    <w:nsid w:val="31D72F47"/>
     <w:multiLevelType w:val="multilevel"/>
-    <w:tmpl w:val="C46627C6"/>
-    <w:lvl w:ilvl="0">
-      <w:start w:val="1"/>
-      <w:numFmt w:val="decimal"/>
-      <w:lvlText w:val="%1."/>
-      <w:lvlJc w:val="left"/>
-      <w:pPr>
-        <w:tabs>
-          <w:tab w:val="num" w:pos="720"/>
-        </w:tabs>
-        <w:ind w:left="720" w:hanging="360"/>
-      </w:pPr>
-    </w:lvl>
-    <w:lvl w:ilvl="1" w:tentative="1">
-      <w:start w:val="1"/>
-      <w:numFmt w:val="decimal"/>
-      <w:lvlText w:val="%2."/>
-      <w:lvlJc w:val="left"/>
-      <w:pPr>
-        <w:tabs>
-          <w:tab w:val="num" w:pos="1440"/>
-        </w:tabs>
-        <w:ind w:left="1440" w:hanging="360"/>
-      </w:pPr>
-    </w:lvl>
-    <w:lvl w:ilvl="2" w:tentative="1">
-      <w:start w:val="1"/>
-      <w:numFmt w:val="decimal"/>
-      <w:lvlText w:val="%3."/>
-      <w:lvlJc w:val="left"/>
-      <w:pPr>
-        <w:tabs>
-          <w:tab w:val="num" w:pos="2160"/>
-        </w:tabs>
-        <w:ind w:left="2160" w:hanging="360"/>
-      </w:pPr>
-    </w:lvl>
-    <w:lvl w:ilvl="3" w:tentative="1">
-      <w:start w:val="1"/>
-      <w:numFmt w:val="decimal"/>
-      <w:lvlText w:val="%4."/>
-      <w:lvlJc w:val="left"/>
-      <w:pPr>
-        <w:tabs>
-          <w:tab w:val="num" w:pos="2880"/>
-        </w:tabs>
-        <w:ind w:left="2880" w:hanging="360"/>
-      </w:pPr>
-    </w:lvl>
-    <w:lvl w:ilvl="4" w:tentative="1">
-      <w:start w:val="1"/>
-      <w:numFmt w:val="decimal"/>
-      <w:lvlText w:val="%5."/>
-      <w:lvlJc w:val="left"/>
-      <w:pPr>
-        <w:tabs>
-          <w:tab w:val="num" w:pos="3600"/>
-        </w:tabs>
-        <w:ind w:left="3600" w:hanging="360"/>
-      </w:pPr>
-    </w:lvl>
-    <w:lvl w:ilvl="5" w:tentative="1">
-      <w:start w:val="1"/>
-      <w:numFmt w:val="decimal"/>
-      <w:lvlText w:val="%6."/>
-      <w:lvlJc w:val="left"/>
-      <w:pPr>
-        <w:tabs>
-          <w:tab w:val="num" w:pos="4320"/>
-        </w:tabs>
-        <w:ind w:left="4320" w:hanging="360"/>
-      </w:pPr>
-    </w:lvl>
-    <w:lvl w:ilvl="6" w:tentative="1">
-      <w:start w:val="1"/>
-      <w:numFmt w:val="decimal"/>
-      <w:lvlText w:val="%7."/>
-      <w:lvlJc w:val="left"/>
-      <w:pPr>
-        <w:tabs>
-          <w:tab w:val="num" w:pos="5040"/>
-        </w:tabs>
-        <w:ind w:left="5040" w:hanging="360"/>
-      </w:pPr>
-    </w:lvl>
-    <w:lvl w:ilvl="7" w:tentative="1">
-      <w:start w:val="1"/>
-      <w:numFmt w:val="decimal"/>
-      <w:lvlText w:val="%8."/>
-      <w:lvlJc w:val="left"/>
-      <w:pPr>
-        <w:tabs>
-          <w:tab w:val="num" w:pos="5760"/>
-        </w:tabs>
-        <w:ind w:left="5760" w:hanging="360"/>
-      </w:pPr>
-    </w:lvl>
-    <w:lvl w:ilvl="8" w:tentative="1">
-      <w:start w:val="1"/>
-      <w:numFmt w:val="decimal"/>
-      <w:lvlText w:val="%9."/>
-      <w:lvlJc w:val="left"/>
-      <w:pPr>
-        <w:tabs>
-          <w:tab w:val="num" w:pos="6480"/>
-        </w:tabs>
-        <w:ind w:left="6480" w:hanging="360"/>
-      </w:pPr>
-    </w:lvl>
-  </w:abstractNum>
-  <w:abstractNum w:abstractNumId="10" w15:restartNumberingAfterBreak="0">
-    <w:nsid w:val="78AE0400"/>
-    <w:multiLevelType w:val="multilevel"/>
-    <w:tmpl w:val="262A71EA"/>
+    <w:tmpl w:val="01B4BFE4"/>
     <w:lvl w:ilvl="0">
       <w:start w:val="1"/>
       <w:numFmt w:val="bullet"/>
@@ -21209,38 +21446,377 @@
       </w:rPr>
     </w:lvl>
   </w:abstractNum>
-  <w:num w:numId="1" w16cid:durableId="673534260">
+  <w:abstractNum w:abstractNumId="8" w15:restartNumberingAfterBreak="0">
+    <w:nsid w:val="3A312A4F"/>
+    <w:multiLevelType w:val="multilevel"/>
+    <w:tmpl w:val="C6F41648"/>
+    <w:lvl w:ilvl="0">
+      <w:start w:val="1"/>
+      <w:numFmt w:val="decimal"/>
+      <w:lvlText w:val="%1."/>
+      <w:lvlJc w:val="left"/>
+      <w:pPr>
+        <w:tabs>
+          <w:tab w:val="num" w:pos="720"/>
+        </w:tabs>
+        <w:ind w:left="720" w:hanging="360"/>
+      </w:pPr>
+    </w:lvl>
+    <w:lvl w:ilvl="1" w:tentative="1">
+      <w:start w:val="1"/>
+      <w:numFmt w:val="decimal"/>
+      <w:lvlText w:val="%2."/>
+      <w:lvlJc w:val="left"/>
+      <w:pPr>
+        <w:tabs>
+          <w:tab w:val="num" w:pos="1440"/>
+        </w:tabs>
+        <w:ind w:left="1440" w:hanging="360"/>
+      </w:pPr>
+    </w:lvl>
+    <w:lvl w:ilvl="2" w:tentative="1">
+      <w:start w:val="1"/>
+      <w:numFmt w:val="decimal"/>
+      <w:lvlText w:val="%3."/>
+      <w:lvlJc w:val="left"/>
+      <w:pPr>
+        <w:tabs>
+          <w:tab w:val="num" w:pos="2160"/>
+        </w:tabs>
+        <w:ind w:left="2160" w:hanging="360"/>
+      </w:pPr>
+    </w:lvl>
+    <w:lvl w:ilvl="3" w:tentative="1">
+      <w:start w:val="1"/>
+      <w:numFmt w:val="decimal"/>
+      <w:lvlText w:val="%4."/>
+      <w:lvlJc w:val="left"/>
+      <w:pPr>
+        <w:tabs>
+          <w:tab w:val="num" w:pos="2880"/>
+        </w:tabs>
+        <w:ind w:left="2880" w:hanging="360"/>
+      </w:pPr>
+    </w:lvl>
+    <w:lvl w:ilvl="4" w:tentative="1">
+      <w:start w:val="1"/>
+      <w:numFmt w:val="decimal"/>
+      <w:lvlText w:val="%5."/>
+      <w:lvlJc w:val="left"/>
+      <w:pPr>
+        <w:tabs>
+          <w:tab w:val="num" w:pos="3600"/>
+        </w:tabs>
+        <w:ind w:left="3600" w:hanging="360"/>
+      </w:pPr>
+    </w:lvl>
+    <w:lvl w:ilvl="5" w:tentative="1">
+      <w:start w:val="1"/>
+      <w:numFmt w:val="decimal"/>
+      <w:lvlText w:val="%6."/>
+      <w:lvlJc w:val="left"/>
+      <w:pPr>
+        <w:tabs>
+          <w:tab w:val="num" w:pos="4320"/>
+        </w:tabs>
+        <w:ind w:left="4320" w:hanging="360"/>
+      </w:pPr>
+    </w:lvl>
+    <w:lvl w:ilvl="6" w:tentative="1">
+      <w:start w:val="1"/>
+      <w:numFmt w:val="decimal"/>
+      <w:lvlText w:val="%7."/>
+      <w:lvlJc w:val="left"/>
+      <w:pPr>
+        <w:tabs>
+          <w:tab w:val="num" w:pos="5040"/>
+        </w:tabs>
+        <w:ind w:left="5040" w:hanging="360"/>
+      </w:pPr>
+    </w:lvl>
+    <w:lvl w:ilvl="7" w:tentative="1">
+      <w:start w:val="1"/>
+      <w:numFmt w:val="decimal"/>
+      <w:lvlText w:val="%8."/>
+      <w:lvlJc w:val="left"/>
+      <w:pPr>
+        <w:tabs>
+          <w:tab w:val="num" w:pos="5760"/>
+        </w:tabs>
+        <w:ind w:left="5760" w:hanging="360"/>
+      </w:pPr>
+    </w:lvl>
+    <w:lvl w:ilvl="8" w:tentative="1">
+      <w:start w:val="1"/>
+      <w:numFmt w:val="decimal"/>
+      <w:lvlText w:val="%9."/>
+      <w:lvlJc w:val="left"/>
+      <w:pPr>
+        <w:tabs>
+          <w:tab w:val="num" w:pos="6480"/>
+        </w:tabs>
+        <w:ind w:left="6480" w:hanging="360"/>
+      </w:pPr>
+    </w:lvl>
+  </w:abstractNum>
+  <w:abstractNum w:abstractNumId="9" w15:restartNumberingAfterBreak="0">
+    <w:nsid w:val="43E319E9"/>
+    <w:multiLevelType w:val="multilevel"/>
+    <w:tmpl w:val="482E7840"/>
+    <w:lvl w:ilvl="0">
+      <w:start w:val="1"/>
+      <w:numFmt w:val="decimal"/>
+      <w:lvlText w:val="%1."/>
+      <w:lvlJc w:val="left"/>
+      <w:pPr>
+        <w:tabs>
+          <w:tab w:val="num" w:pos="720"/>
+        </w:tabs>
+        <w:ind w:left="720" w:hanging="360"/>
+      </w:pPr>
+    </w:lvl>
+    <w:lvl w:ilvl="1" w:tentative="1">
+      <w:start w:val="1"/>
+      <w:numFmt w:val="decimal"/>
+      <w:lvlText w:val="%2."/>
+      <w:lvlJc w:val="left"/>
+      <w:pPr>
+        <w:tabs>
+          <w:tab w:val="num" w:pos="1440"/>
+        </w:tabs>
+        <w:ind w:left="1440" w:hanging="360"/>
+      </w:pPr>
+    </w:lvl>
+    <w:lvl w:ilvl="2" w:tentative="1">
+      <w:start w:val="1"/>
+      <w:numFmt w:val="decimal"/>
+      <w:lvlText w:val="%3."/>
+      <w:lvlJc w:val="left"/>
+      <w:pPr>
+        <w:tabs>
+          <w:tab w:val="num" w:pos="2160"/>
+        </w:tabs>
+        <w:ind w:left="2160" w:hanging="360"/>
+      </w:pPr>
+    </w:lvl>
+    <w:lvl w:ilvl="3" w:tentative="1">
+      <w:start w:val="1"/>
+      <w:numFmt w:val="decimal"/>
+      <w:lvlText w:val="%4."/>
+      <w:lvlJc w:val="left"/>
+      <w:pPr>
+        <w:tabs>
+          <w:tab w:val="num" w:pos="2880"/>
+        </w:tabs>
+        <w:ind w:left="2880" w:hanging="360"/>
+      </w:pPr>
+    </w:lvl>
+    <w:lvl w:ilvl="4" w:tentative="1">
+      <w:start w:val="1"/>
+      <w:numFmt w:val="decimal"/>
+      <w:lvlText w:val="%5."/>
+      <w:lvlJc w:val="left"/>
+      <w:pPr>
+        <w:tabs>
+          <w:tab w:val="num" w:pos="3600"/>
+        </w:tabs>
+        <w:ind w:left="3600" w:hanging="360"/>
+      </w:pPr>
+    </w:lvl>
+    <w:lvl w:ilvl="5" w:tentative="1">
+      <w:start w:val="1"/>
+      <w:numFmt w:val="decimal"/>
+      <w:lvlText w:val="%6."/>
+      <w:lvlJc w:val="left"/>
+      <w:pPr>
+        <w:tabs>
+          <w:tab w:val="num" w:pos="4320"/>
+        </w:tabs>
+        <w:ind w:left="4320" w:hanging="360"/>
+      </w:pPr>
+    </w:lvl>
+    <w:lvl w:ilvl="6" w:tentative="1">
+      <w:start w:val="1"/>
+      <w:numFmt w:val="decimal"/>
+      <w:lvlText w:val="%7."/>
+      <w:lvlJc w:val="left"/>
+      <w:pPr>
+        <w:tabs>
+          <w:tab w:val="num" w:pos="5040"/>
+        </w:tabs>
+        <w:ind w:left="5040" w:hanging="360"/>
+      </w:pPr>
+    </w:lvl>
+    <w:lvl w:ilvl="7" w:tentative="1">
+      <w:start w:val="1"/>
+      <w:numFmt w:val="decimal"/>
+      <w:lvlText w:val="%8."/>
+      <w:lvlJc w:val="left"/>
+      <w:pPr>
+        <w:tabs>
+          <w:tab w:val="num" w:pos="5760"/>
+        </w:tabs>
+        <w:ind w:left="5760" w:hanging="360"/>
+      </w:pPr>
+    </w:lvl>
+    <w:lvl w:ilvl="8" w:tentative="1">
+      <w:start w:val="1"/>
+      <w:numFmt w:val="decimal"/>
+      <w:lvlText w:val="%9."/>
+      <w:lvlJc w:val="left"/>
+      <w:pPr>
+        <w:tabs>
+          <w:tab w:val="num" w:pos="6480"/>
+        </w:tabs>
+        <w:ind w:left="6480" w:hanging="360"/>
+      </w:pPr>
+    </w:lvl>
+  </w:abstractNum>
+  <w:abstractNum w:abstractNumId="10" w15:restartNumberingAfterBreak="0">
+    <w:nsid w:val="4764027B"/>
+    <w:multiLevelType w:val="multilevel"/>
+    <w:tmpl w:val="A43ADA04"/>
+    <w:lvl w:ilvl="0">
+      <w:start w:val="3"/>
+      <w:numFmt w:val="decimal"/>
+      <w:lvlText w:val="%1."/>
+      <w:lvlJc w:val="left"/>
+      <w:pPr>
+        <w:tabs>
+          <w:tab w:val="num" w:pos="720"/>
+        </w:tabs>
+        <w:ind w:left="720" w:hanging="360"/>
+      </w:pPr>
+    </w:lvl>
+    <w:lvl w:ilvl="1" w:tentative="1">
+      <w:start w:val="1"/>
+      <w:numFmt w:val="decimal"/>
+      <w:lvlText w:val="%2."/>
+      <w:lvlJc w:val="left"/>
+      <w:pPr>
+        <w:tabs>
+          <w:tab w:val="num" w:pos="1440"/>
+        </w:tabs>
+        <w:ind w:left="1440" w:hanging="360"/>
+      </w:pPr>
+    </w:lvl>
+    <w:lvl w:ilvl="2" w:tentative="1">
+      <w:start w:val="1"/>
+      <w:numFmt w:val="decimal"/>
+      <w:lvlText w:val="%3."/>
+      <w:lvlJc w:val="left"/>
+      <w:pPr>
+        <w:tabs>
+          <w:tab w:val="num" w:pos="2160"/>
+        </w:tabs>
+        <w:ind w:left="2160" w:hanging="360"/>
+      </w:pPr>
+    </w:lvl>
+    <w:lvl w:ilvl="3" w:tentative="1">
+      <w:start w:val="1"/>
+      <w:numFmt w:val="decimal"/>
+      <w:lvlText w:val="%4."/>
+      <w:lvlJc w:val="left"/>
+      <w:pPr>
+        <w:tabs>
+          <w:tab w:val="num" w:pos="2880"/>
+        </w:tabs>
+        <w:ind w:left="2880" w:hanging="360"/>
+      </w:pPr>
+    </w:lvl>
+    <w:lvl w:ilvl="4" w:tentative="1">
+      <w:start w:val="1"/>
+      <w:numFmt w:val="decimal"/>
+      <w:lvlText w:val="%5."/>
+      <w:lvlJc w:val="left"/>
+      <w:pPr>
+        <w:tabs>
+          <w:tab w:val="num" w:pos="3600"/>
+        </w:tabs>
+        <w:ind w:left="3600" w:hanging="360"/>
+      </w:pPr>
+    </w:lvl>
+    <w:lvl w:ilvl="5" w:tentative="1">
+      <w:start w:val="1"/>
+      <w:numFmt w:val="decimal"/>
+      <w:lvlText w:val="%6."/>
+      <w:lvlJc w:val="left"/>
+      <w:pPr>
+        <w:tabs>
+          <w:tab w:val="num" w:pos="4320"/>
+        </w:tabs>
+        <w:ind w:left="4320" w:hanging="360"/>
+      </w:pPr>
+    </w:lvl>
+    <w:lvl w:ilvl="6" w:tentative="1">
+      <w:start w:val="1"/>
+      <w:numFmt w:val="decimal"/>
+      <w:lvlText w:val="%7."/>
+      <w:lvlJc w:val="left"/>
+      <w:pPr>
+        <w:tabs>
+          <w:tab w:val="num" w:pos="5040"/>
+        </w:tabs>
+        <w:ind w:left="5040" w:hanging="360"/>
+      </w:pPr>
+    </w:lvl>
+    <w:lvl w:ilvl="7" w:tentative="1">
+      <w:start w:val="1"/>
+      <w:numFmt w:val="decimal"/>
+      <w:lvlText w:val="%8."/>
+      <w:lvlJc w:val="left"/>
+      <w:pPr>
+        <w:tabs>
+          <w:tab w:val="num" w:pos="5760"/>
+        </w:tabs>
+        <w:ind w:left="5760" w:hanging="360"/>
+      </w:pPr>
+    </w:lvl>
+    <w:lvl w:ilvl="8" w:tentative="1">
+      <w:start w:val="1"/>
+      <w:numFmt w:val="decimal"/>
+      <w:lvlText w:val="%9."/>
+      <w:lvlJc w:val="left"/>
+      <w:pPr>
+        <w:tabs>
+          <w:tab w:val="num" w:pos="6480"/>
+        </w:tabs>
+        <w:ind w:left="6480" w:hanging="360"/>
+      </w:pPr>
+    </w:lvl>
+  </w:abstractNum>
+  <w:num w:numId="1" w16cid:durableId="1407608307">
+    <w:abstractNumId w:val="1"/>
+  </w:num>
+  <w:num w:numId="2" w16cid:durableId="4135858">
+    <w:abstractNumId w:val="0"/>
+  </w:num>
+  <w:num w:numId="3" w16cid:durableId="440953095">
+    <w:abstractNumId w:val="8"/>
+  </w:num>
+  <w:num w:numId="4" w16cid:durableId="1639871491">
+    <w:abstractNumId w:val="6"/>
+  </w:num>
+  <w:num w:numId="5" w16cid:durableId="1832401897">
     <w:abstractNumId w:val="5"/>
   </w:num>
-  <w:num w:numId="2" w16cid:durableId="2075083554">
+  <w:num w:numId="6" w16cid:durableId="2054452543">
     <w:abstractNumId w:val="2"/>
   </w:num>
-  <w:num w:numId="3" w16cid:durableId="683746892">
+  <w:num w:numId="7" w16cid:durableId="795224037">
+    <w:abstractNumId w:val="10"/>
+  </w:num>
+  <w:num w:numId="8" w16cid:durableId="1343777128">
+    <w:abstractNumId w:val="9"/>
+  </w:num>
+  <w:num w:numId="9" w16cid:durableId="637344549">
     <w:abstractNumId w:val="4"/>
   </w:num>
-  <w:num w:numId="4" w16cid:durableId="938218128">
+  <w:num w:numId="10" w16cid:durableId="230778871">
     <w:abstractNumId w:val="3"/>
   </w:num>
-  <w:num w:numId="5" w16cid:durableId="299263273">
-    <w:abstractNumId w:val="9"/>
-  </w:num>
-  <w:num w:numId="6" w16cid:durableId="1350913280">
-    <w:abstractNumId w:val="0"/>
-  </w:num>
-  <w:num w:numId="7" w16cid:durableId="1261646459">
-    <w:abstractNumId w:val="1"/>
-  </w:num>
-  <w:num w:numId="8" w16cid:durableId="638846331">
-    <w:abstractNumId w:val="6"/>
-  </w:num>
-  <w:num w:numId="9" w16cid:durableId="1418819177">
-    <w:abstractNumId w:val="10"/>
-  </w:num>
-  <w:num w:numId="10" w16cid:durableId="28454720">
+  <w:num w:numId="11" w16cid:durableId="109982440">
     <w:abstractNumId w:val="7"/>
-  </w:num>
-  <w:num w:numId="11" w16cid:durableId="1056583542">
-    <w:abstractNumId w:val="8"/>
   </w:num>
 </w:numbering>
 </file>

</xml_diff>